<commit_message>
Correct approved labs 02–04 and rebuild reports and presentations
</commit_message>
<xml_diff>
--- a/labs/lab04/report/infosec-intro--lab04--report.docx
+++ b/labs/lab04/report/infosec-intro--lab04--report.docx
@@ -7,7 +7,31 @@
         <w:pStyle w:val="Title"/>
       </w:pPr>
       <w:r>
-        <w:t xml:space="preserve">Отчёт по лабораторной работе №4</w:t>
+        <w:t xml:space="preserve">Отчёт</w:t>
+      </w:r>
+      <w:r>
+        <w:t xml:space="preserve"> </w:t>
+      </w:r>
+      <w:r>
+        <w:t xml:space="preserve">по</w:t>
+      </w:r>
+      <w:r>
+        <w:t xml:space="preserve"> </w:t>
+      </w:r>
+      <w:r>
+        <w:t xml:space="preserve">лабораторной</w:t>
+      </w:r>
+      <w:r>
+        <w:t xml:space="preserve"> </w:t>
+      </w:r>
+      <w:r>
+        <w:t xml:space="preserve">работе</w:t>
+      </w:r>
+      <w:r>
+        <w:t xml:space="preserve"> </w:t>
+      </w:r>
+      <w:r>
+        <w:t xml:space="preserve">№4</w:t>
       </w:r>
     </w:p>
     <w:p>
@@ -15,7 +39,43 @@
         <w:pStyle w:val="Subtitle"/>
       </w:pPr>
       <w:r>
-        <w:t xml:space="preserve">Дискреционное разграничение прав в Linux. Расширенные атрибуты</w:t>
+        <w:t xml:space="preserve">Дискреционное</w:t>
+      </w:r>
+      <w:r>
+        <w:t xml:space="preserve"> </w:t>
+      </w:r>
+      <w:r>
+        <w:t xml:space="preserve">разграничение</w:t>
+      </w:r>
+      <w:r>
+        <w:t xml:space="preserve"> </w:t>
+      </w:r>
+      <w:r>
+        <w:t xml:space="preserve">прав</w:t>
+      </w:r>
+      <w:r>
+        <w:t xml:space="preserve"> </w:t>
+      </w:r>
+      <w:r>
+        <w:t xml:space="preserve">в</w:t>
+      </w:r>
+      <w:r>
+        <w:t xml:space="preserve"> </w:t>
+      </w:r>
+      <w:r>
+        <w:t xml:space="preserve">Linux.</w:t>
+      </w:r>
+      <w:r>
+        <w:t xml:space="preserve"> </w:t>
+      </w:r>
+      <w:r>
+        <w:t xml:space="preserve">Расширенные</w:t>
+      </w:r>
+      <w:r>
+        <w:t xml:space="preserve"> </w:t>
+      </w:r>
+      <w:r>
+        <w:t xml:space="preserve">атрибуты</w:t>
       </w:r>
     </w:p>
     <w:p>
@@ -23,7 +83,49 @@
         <w:pStyle w:val="Author"/>
       </w:pPr>
       <w:r>
-        <w:t xml:space="preserve">Архипов Александр</w:t>
+        <w:t xml:space="preserve">Архипов</w:t>
+      </w:r>
+      <w:r>
+        <w:t xml:space="preserve"> </w:t>
+      </w:r>
+      <w:r>
+        <w:t xml:space="preserve">Александр</w:t>
+      </w:r>
+      <w:r>
+        <w:t xml:space="preserve"> </w:t>
+      </w:r>
+      <w:r>
+        <w:t xml:space="preserve">Сергеевич</w:t>
+      </w:r>
+      <w:r>
+        <w:br/>
+      </w:r>
+      <w:r>
+        <w:t xml:space="preserve">НБИбд-01-24</w:t>
+      </w:r>
+      <w:r>
+        <w:br/>
+      </w:r>
+      <w:r>
+        <w:t xml:space="preserve">Студенческий</w:t>
+      </w:r>
+      <w:r>
+        <w:t xml:space="preserve"> </w:t>
+      </w:r>
+      <w:r>
+        <w:t xml:space="preserve">билет</w:t>
+      </w:r>
+      <w:r>
+        <w:t xml:space="preserve"> </w:t>
+      </w:r>
+      <w:r>
+        <w:t xml:space="preserve">1132239106</w:t>
+      </w:r>
+      <w:r>
+        <w:br/>
+      </w:r>
+      <w:r>
+        <w:t xml:space="preserve">1132239106@rudn.ru</w:t>
       </w:r>
     </w:p>
     <w:sdt>
@@ -44,21 +146,42 @@
         </w:p>
         <w:p>
           <w:r>
-            <w:fldChar w:fldCharType="begin" w:dirty="true"/>
-            <w:instrText xml:space="preserve">TOC \o "1-2" \h \z \u</w:instrText>
-            <w:fldChar w:fldCharType="separate"/>
-            <w:fldChar w:fldCharType="end"/>
+            <w:t>Цель работы</w:t>
+          </w:r>
+        </w:p>
+        <w:p>
+          <w:r>
+            <w:t>Выполнение лабораторной работы</w:t>
+          </w:r>
+        </w:p>
+        <w:p>
+          <w:r>
+            <w:t>Выводы</w:t>
+          </w:r>
+        </w:p>
+        <w:p>
+          <w:r>
+            <w:t>Список литературы</w:t>
           </w:r>
         </w:p>
       </w:sdtContent>
     </w:sdt>
-    <w:bookmarkStart w:id="9" w:name="цель-работы"/>
+    <w:bookmarkStart w:id="20" w:name="цель-работы"/>
     <w:p>
       <w:pPr>
         <w:pStyle w:val="Heading1"/>
       </w:pPr>
       <w:r>
-        <w:t xml:space="preserve">1. Цель работы</w:t>
+        <w:rPr>
+          <w:rStyle w:val="SectionNumber"/>
+        </w:rPr>
+        <w:t xml:space="preserve">1</w:t>
+      </w:r>
+      <w:r>
+        <w:tab/>
+      </w:r>
+      <w:r>
+        <w:t xml:space="preserve">Цель работы</w:t>
       </w:r>
     </w:p>
     <w:p>
@@ -69,14 +192,23 @@
         <w:t xml:space="preserve">Получение практических навыков работы в консоли с расширенными атрибутами файлов.</w:t>
       </w:r>
     </w:p>
-    <w:bookmarkEnd w:id="9"/>
-    <w:bookmarkStart w:id="26" w:name="выполнение-лабораторной-работы"/>
+    <w:bookmarkEnd w:id="20"/>
+    <w:bookmarkStart w:id="33" w:name="выполнение-лабораторной-работы"/>
     <w:p>
       <w:pPr>
         <w:pStyle w:val="Heading1"/>
       </w:pPr>
       <w:r>
-        <w:t xml:space="preserve">2. Выполнение лабораторной работы</w:t>
+        <w:rPr>
+          <w:rStyle w:val="SectionNumber"/>
+        </w:rPr>
+        <w:t xml:space="preserve">2</w:t>
+      </w:r>
+      <w:r>
+        <w:tab/>
+      </w:r>
+      <w:r>
+        <w:t xml:space="preserve">Выполнение лабораторной работы</w:t>
       </w:r>
     </w:p>
     <w:p>
@@ -101,7 +233,6 @@
         <w:t xml:space="preserve">Установите командой chmod 600 file1 на файл file1 права, разрешающие чтение и запись для владельца файла.</w:t>
       </w:r>
     </w:p>
-    <w:bookmarkStart w:id="13" w:name="fig:001"/>
     <w:p>
       <w:pPr>
         <w:pStyle w:val="CaptionedFigure"/>
@@ -109,20 +240,20 @@
       <w:r>
         <w:drawing>
           <wp:inline>
-            <wp:extent cx="3733800" cy="1671448"/>
+            <wp:extent cx="4178300" cy="1870430"/>
             <wp:effectExtent b="0" l="0" r="0" t="0"/>
-            <wp:docPr descr="права доступа" title="" id="11" name="Picture"/>
+            <wp:docPr descr="права доступа" title="" id="22" name="Picture"/>
             <a:graphic>
               <a:graphicData uri="http://schemas.openxmlformats.org/drawingml/2006/picture">
                 <pic:pic>
                   <pic:nvPicPr>
-                    <pic:cNvPr descr="image/01.png" id="12" name="Picture"/>
+                    <pic:cNvPr descr="image/01.png" id="23" name="Picture"/>
                     <pic:cNvPicPr>
                       <a:picLocks noChangeArrowheads="1" noChangeAspect="1"/>
                     </pic:cNvPicPr>
                   </pic:nvPicPr>
                   <pic:blipFill>
-                    <a:blip r:embed="rId10"/>
+                    <a:blip r:embed="rId21"/>
                     <a:stretch>
                       <a:fillRect/>
                     </a:stretch>
@@ -130,7 +261,7 @@
                   <pic:spPr bwMode="auto">
                     <a:xfrm>
                       <a:off x="0" y="0"/>
-                      <a:ext cx="3733800" cy="1671448"/>
+                      <a:ext cx="4178300" cy="1870430"/>
                     </a:xfrm>
                     <a:prstGeom prst="rect">
                       <a:avLst/>
@@ -157,14 +288,13 @@
         <w:t xml:space="preserve">права доступа</w:t>
       </w:r>
     </w:p>
-    <w:bookmarkEnd w:id="13"/>
-    <w:p>
-      <w:pPr>
-        <w:pStyle w:val="Compact"/>
+    <w:p>
+      <w:pPr>
         <w:numPr>
           <w:ilvl w:val="0"/>
           <w:numId w:val="1002"/>
         </w:numPr>
+        <w:pStyle w:val="Compact"/>
       </w:pPr>
       <w:r>
         <w:t xml:space="preserve">Попробуйте установить на файл /home/guest/dir1/file1 расширенный атрибут a от имени пользователя guest: chattr +a /home/guest/dir1/file1</w:t>
@@ -175,16 +305,16 @@
         <w:pStyle w:val="FirstParagraph"/>
       </w:pPr>
       <w:r>
-        <w:t xml:space="preserve">Получаем отказ, для смены расширенных атрибутов недостаточно прав.</w:t>
-      </w:r>
-    </w:p>
-    <w:p>
-      <w:pPr>
-        <w:pStyle w:val="Compact"/>
+        <w:t xml:space="preserve">Установка атрибута a требует привилегий. В имеющихся скриншотах показана установка от root; попытка от guest отдельным снимком не подтверждена.</w:t>
+      </w:r>
+    </w:p>
+    <w:p>
+      <w:pPr>
         <w:numPr>
           <w:ilvl w:val="0"/>
           <w:numId w:val="1003"/>
         </w:numPr>
+        <w:pStyle w:val="Compact"/>
       </w:pPr>
       <w:r>
         <w:t xml:space="preserve">Зайдите на третью консоль с правами администратора либо повысьте свои права с помощью команды su. Попробуйте установить расширенный атрибут a на файл /home/guest/dir1/file1 от имени суперпользователя: chattr +a /home/guest/dir1/file1</w:t>
@@ -200,11 +330,11 @@
     </w:p>
     <w:p>
       <w:pPr>
-        <w:pStyle w:val="Compact"/>
         <w:numPr>
           <w:ilvl w:val="0"/>
           <w:numId w:val="1004"/>
         </w:numPr>
+        <w:pStyle w:val="Compact"/>
       </w:pPr>
       <w:r>
         <w:t xml:space="preserve">От пользователя guest проверьте правильность установления атрибута: lsattr /home/guest/dir1/file1</w:t>
@@ -215,16 +345,16 @@
         <w:pStyle w:val="FirstParagraph"/>
       </w:pPr>
       <w:r>
-        <w:t xml:space="preserve">Атрибут –а установлен.</w:t>
-      </w:r>
-    </w:p>
-    <w:p>
-      <w:pPr>
-        <w:pStyle w:val="Compact"/>
+        <w:t xml:space="preserve">Атрибут a установлен.</w:t>
+      </w:r>
+    </w:p>
+    <w:p>
+      <w:pPr>
         <w:numPr>
           <w:ilvl w:val="0"/>
           <w:numId w:val="1005"/>
         </w:numPr>
+        <w:pStyle w:val="Compact"/>
       </w:pPr>
       <w:r>
         <w:t xml:space="preserve">Выполните дозапись в файл file1 слова «test» командой echo</w:t>
@@ -233,7 +363,13 @@
         <w:t xml:space="preserve"> </w:t>
       </w:r>
       <w:r>
-        <w:t xml:space="preserve">“test”</w:t>
+        <w:t xml:space="preserve">“</w:t>
+      </w:r>
+      <w:r>
+        <w:t xml:space="preserve">test</w:t>
+      </w:r>
+      <w:r>
+        <w:t xml:space="preserve">”</w:t>
       </w:r>
       <w:r>
         <w:t xml:space="preserve"> </w:t>
@@ -255,16 +391,31 @@
         <w:pStyle w:val="BodyText"/>
       </w:pPr>
       <w:r>
-        <w:t xml:space="preserve">После этого выполните чтение файла file1 командой cat /home/guest/dir1/file1 Файл содержит строку “test”.</w:t>
-      </w:r>
-    </w:p>
-    <w:p>
-      <w:pPr>
-        <w:pStyle w:val="Compact"/>
+        <w:t xml:space="preserve">После этого выполните чтение файла file1 командой cat /home/guest/dir1/file1 Файл содержит строку</w:t>
+      </w:r>
+      <w:r>
+        <w:t xml:space="preserve"> </w:t>
+      </w:r>
+      <w:r>
+        <w:t xml:space="preserve">“</w:t>
+      </w:r>
+      <w:r>
+        <w:t xml:space="preserve">test</w:t>
+      </w:r>
+      <w:r>
+        <w:t xml:space="preserve">”</w:t>
+      </w:r>
+      <w:r>
+        <w:t xml:space="preserve">.</w:t>
+      </w:r>
+    </w:p>
+    <w:p>
+      <w:pPr>
         <w:numPr>
           <w:ilvl w:val="0"/>
           <w:numId w:val="1006"/>
         </w:numPr>
+        <w:pStyle w:val="Compact"/>
       </w:pPr>
       <w:r>
         <w:t xml:space="preserve">Попробуйте удалить файл file1 либо стереть имеющуюся в нём информацию командой echo</w:t>
@@ -273,13 +424,19 @@
         <w:t xml:space="preserve"> </w:t>
       </w:r>
       <w:r>
-        <w:t xml:space="preserve">“abcd”</w:t>
+        <w:t xml:space="preserve">“</w:t>
+      </w:r>
+      <w:r>
+        <w:t xml:space="preserve">abcd</w:t>
+      </w:r>
+      <w:r>
+        <w:t xml:space="preserve">”</w:t>
       </w:r>
       <w:r>
         <w:t xml:space="preserve"> </w:t>
       </w:r>
       <w:r>
-        <w:t xml:space="preserve">&gt; /home/guest/dirl/file1 Попробуйте переименовать файл.</w:t>
+        <w:t xml:space="preserve">&gt; /home/guest/dir1/file1 Попробуйте переименовать файл.</w:t>
       </w:r>
     </w:p>
     <w:p>
@@ -292,11 +449,11 @@
     </w:p>
     <w:p>
       <w:pPr>
-        <w:pStyle w:val="Compact"/>
         <w:numPr>
           <w:ilvl w:val="0"/>
           <w:numId w:val="1007"/>
         </w:numPr>
+        <w:pStyle w:val="Compact"/>
       </w:pPr>
       <w:r>
         <w:t xml:space="preserve">Попробуйте с помощью команды chmod 000 file1 установить на файл file1 права, например, запрещающие чтение и запись для владельца файла. Удалось ли вам успешно выполнить указанные команды?</w:t>
@@ -310,7 +467,6 @@
         <w:t xml:space="preserve">Команда изменения прав также не выполняется.</w:t>
       </w:r>
     </w:p>
-    <w:bookmarkStart w:id="17" w:name="fig:002"/>
     <w:p>
       <w:pPr>
         <w:pStyle w:val="CaptionedFigure"/>
@@ -318,20 +474,20 @@
       <w:r>
         <w:drawing>
           <wp:inline>
-            <wp:extent cx="3733800" cy="2365160"/>
+            <wp:extent cx="4178300" cy="2646727"/>
             <wp:effectExtent b="0" l="0" r="0" t="0"/>
-            <wp:docPr descr="атрибут -a" title="" id="15" name="Picture"/>
+            <wp:docPr descr="Установленный атрибут a (chattr +a)" title="" id="25" name="Picture"/>
             <a:graphic>
               <a:graphicData uri="http://schemas.openxmlformats.org/drawingml/2006/picture">
                 <pic:pic>
                   <pic:nvPicPr>
-                    <pic:cNvPr descr="image/02.png" id="16" name="Picture"/>
+                    <pic:cNvPr descr="image/02.png" id="26" name="Picture"/>
                     <pic:cNvPicPr>
                       <a:picLocks noChangeArrowheads="1" noChangeAspect="1"/>
                     </pic:cNvPicPr>
                   </pic:nvPicPr>
                   <pic:blipFill>
-                    <a:blip r:embed="rId14"/>
+                    <a:blip r:embed="rId24"/>
                     <a:stretch>
                       <a:fillRect/>
                     </a:stretch>
@@ -339,7 +495,7 @@
                   <pic:spPr bwMode="auto">
                     <a:xfrm>
                       <a:off x="0" y="0"/>
-                      <a:ext cx="3733800" cy="2365160"/>
+                      <a:ext cx="4178300" cy="2646727"/>
                     </a:xfrm>
                     <a:prstGeom prst="rect">
                       <a:avLst/>
@@ -363,20 +519,19 @@
         <w:pStyle w:val="ImageCaption"/>
       </w:pPr>
       <w:r>
-        <w:t xml:space="preserve">атрибут -a</w:t>
-      </w:r>
-    </w:p>
-    <w:bookmarkEnd w:id="17"/>
-    <w:p>
-      <w:pPr>
-        <w:pStyle w:val="Compact"/>
+        <w:t xml:space="preserve">Установленный атрибут a (chattr +a)</w:t>
+      </w:r>
+    </w:p>
+    <w:p>
+      <w:pPr>
         <w:numPr>
           <w:ilvl w:val="0"/>
           <w:numId w:val="1008"/>
         </w:numPr>
-      </w:pPr>
-      <w:r>
-        <w:t xml:space="preserve">Снимите расширенный атрибут a с файла /home/guest/dirl/file1 от имени суперпользователя командой chattr -a /home/guest/dir1/file1</w:t>
+        <w:pStyle w:val="Compact"/>
+      </w:pPr>
+      <w:r>
+        <w:t xml:space="preserve">Снимите расширенный атрибут a с файла /home/guest/dir1/file1 от имени суперпользователя командой chattr -a /home/guest/dir1/file1</w:t>
       </w:r>
     </w:p>
     <w:p>
@@ -400,10 +555,9 @@
         <w:pStyle w:val="BodyText"/>
       </w:pPr>
       <w:r>
-        <w:t xml:space="preserve">После снятия атрибута –а стало возможным переписать файл, удалить или переименовать его, а также сменить права. Атрибут –а позволяет только дозаписывать файл.</w:t>
-      </w:r>
-    </w:p>
-    <w:bookmarkStart w:id="21" w:name="fig:003"/>
+        <w:t xml:space="preserve">После снятия атрибута –а стало возможным переписать файл, удалить или переименовать его, а также сменить права. Атрибут a позволяет только дозаписывать файл.</w:t>
+      </w:r>
+    </w:p>
     <w:p>
       <w:pPr>
         <w:pStyle w:val="CaptionedFigure"/>
@@ -411,20 +565,20 @@
       <w:r>
         <w:drawing>
           <wp:inline>
-            <wp:extent cx="3733800" cy="2275480"/>
+            <wp:extent cx="4178300" cy="2546371"/>
             <wp:effectExtent b="0" l="0" r="0" t="0"/>
-            <wp:docPr descr="атрибут -a снят" title="" id="19" name="Picture"/>
+            <wp:docPr descr="Атрибут a снят командой chattr -a" title="" id="28" name="Picture"/>
             <a:graphic>
               <a:graphicData uri="http://schemas.openxmlformats.org/drawingml/2006/picture">
                 <pic:pic>
                   <pic:nvPicPr>
-                    <pic:cNvPr descr="image/03.png" id="20" name="Picture"/>
+                    <pic:cNvPr descr="image/03.png" id="29" name="Picture"/>
                     <pic:cNvPicPr>
                       <a:picLocks noChangeArrowheads="1" noChangeAspect="1"/>
                     </pic:cNvPicPr>
                   </pic:nvPicPr>
                   <pic:blipFill>
-                    <a:blip r:embed="rId18"/>
+                    <a:blip r:embed="rId27"/>
                     <a:stretch>
                       <a:fillRect/>
                     </a:stretch>
@@ -432,7 +586,7 @@
                   <pic:spPr bwMode="auto">
                     <a:xfrm>
                       <a:off x="0" y="0"/>
-                      <a:ext cx="3733800" cy="2275480"/>
+                      <a:ext cx="4178300" cy="2546371"/>
                     </a:xfrm>
                     <a:prstGeom prst="rect">
                       <a:avLst/>
@@ -456,17 +610,16 @@
         <w:pStyle w:val="ImageCaption"/>
       </w:pPr>
       <w:r>
-        <w:t xml:space="preserve">атрибут -a снят</w:t>
-      </w:r>
-    </w:p>
-    <w:bookmarkEnd w:id="21"/>
-    <w:p>
-      <w:pPr>
-        <w:pStyle w:val="Compact"/>
+        <w:t xml:space="preserve">Атрибут a снят командой chattr -a</w:t>
+      </w:r>
+    </w:p>
+    <w:p>
+      <w:pPr>
         <w:numPr>
           <w:ilvl w:val="0"/>
           <w:numId w:val="1009"/>
         </w:numPr>
+        <w:pStyle w:val="Compact"/>
       </w:pPr>
       <w:r>
         <w:t xml:space="preserve">Повторите ваши действия по шагам, заменив атрибут «a» атрибутом «i». Удалось ли вам дозаписать информацию в файл? Ваши наблюдения занесите в отчёт.</w:t>
@@ -477,10 +630,9 @@
         <w:pStyle w:val="FirstParagraph"/>
       </w:pPr>
       <w:r>
-        <w:t xml:space="preserve">Атрибут –i запрещает любое изменеие файла: дозапись, переименование, удаление, смену атрибутов.</w:t>
-      </w:r>
-    </w:p>
-    <w:bookmarkStart w:id="25" w:name="fig:004"/>
+        <w:t xml:space="preserve">Атрибут i запрещает любое изменение файла: дозапись, переименование, удаление, смену атрибутов.</w:t>
+      </w:r>
+    </w:p>
     <w:p>
       <w:pPr>
         <w:pStyle w:val="CaptionedFigure"/>
@@ -488,20 +640,20 @@
       <w:r>
         <w:drawing>
           <wp:inline>
-            <wp:extent cx="3733800" cy="2266950"/>
+            <wp:extent cx="4178300" cy="2536825"/>
             <wp:effectExtent b="0" l="0" r="0" t="0"/>
-            <wp:docPr descr="атрибут -i" title="" id="23" name="Picture"/>
+            <wp:docPr descr="Установленный атрибут i (chattr +i)" title="" id="31" name="Picture"/>
             <a:graphic>
               <a:graphicData uri="http://schemas.openxmlformats.org/drawingml/2006/picture">
                 <pic:pic>
                   <pic:nvPicPr>
-                    <pic:cNvPr descr="image/04.png" id="24" name="Picture"/>
+                    <pic:cNvPr descr="image/04.png" id="32" name="Picture"/>
                     <pic:cNvPicPr>
                       <a:picLocks noChangeArrowheads="1" noChangeAspect="1"/>
                     </pic:cNvPicPr>
                   </pic:nvPicPr>
                   <pic:blipFill>
-                    <a:blip r:embed="rId22"/>
+                    <a:blip r:embed="rId30"/>
                     <a:stretch>
                       <a:fillRect/>
                     </a:stretch>
@@ -509,7 +661,7 @@
                   <pic:spPr bwMode="auto">
                     <a:xfrm>
                       <a:off x="0" y="0"/>
-                      <a:ext cx="3733800" cy="2266950"/>
+                      <a:ext cx="4178300" cy="2536825"/>
                     </a:xfrm>
                     <a:prstGeom prst="rect">
                       <a:avLst/>
@@ -533,18 +685,26 @@
         <w:pStyle w:val="ImageCaption"/>
       </w:pPr>
       <w:r>
-        <w:t xml:space="preserve">атрибут -i</w:t>
-      </w:r>
-    </w:p>
-    <w:bookmarkEnd w:id="25"/>
-    <w:bookmarkEnd w:id="26"/>
-    <w:bookmarkStart w:id="27" w:name="выводы"/>
+        <w:t xml:space="preserve">Установленный атрибут i (chattr +i)</w:t>
+      </w:r>
+    </w:p>
+    <w:bookmarkEnd w:id="33"/>
+    <w:bookmarkStart w:id="34" w:name="выводы"/>
     <w:p>
       <w:pPr>
         <w:pStyle w:val="Heading1"/>
       </w:pPr>
       <w:r>
-        <w:t xml:space="preserve">3. Выводы</w:t>
+        <w:rPr>
+          <w:rStyle w:val="SectionNumber"/>
+        </w:rPr>
+        <w:t xml:space="preserve">3</w:t>
+      </w:r>
+      <w:r>
+        <w:tab/>
+      </w:r>
+      <w:r>
+        <w:t xml:space="preserve">Выводы</w:t>
       </w:r>
     </w:p>
     <w:p>
@@ -555,8 +715,8 @@
         <w:t xml:space="preserve">Получены практические навыки работы в консоли с расширенными атрибутами файлов.</w:t>
       </w:r>
     </w:p>
-    <w:bookmarkEnd w:id="27"/>
-    <w:bookmarkStart w:id="30" w:name="список-литературы"/>
+    <w:bookmarkEnd w:id="34"/>
+    <w:bookmarkStart w:id="37" w:name="список-литературы"/>
     <w:p>
       <w:pPr>
         <w:pStyle w:val="Heading1"/>
@@ -567,13 +727,13 @@
     </w:p>
     <w:p>
       <w:pPr>
-        <w:pStyle w:val="Compact"/>
         <w:numPr>
           <w:ilvl w:val="0"/>
           <w:numId w:val="1010"/>
         </w:numPr>
-      </w:pPr>
-      <w:hyperlink r:id="rId28">
+        <w:pStyle w:val="Compact"/>
+      </w:pPr>
+      <w:hyperlink r:id="rId35">
         <w:r>
           <w:rPr>
             <w:rStyle w:val="Hyperlink"/>
@@ -584,13 +744,13 @@
     </w:p>
     <w:p>
       <w:pPr>
-        <w:pStyle w:val="Compact"/>
         <w:numPr>
           <w:ilvl w:val="0"/>
           <w:numId w:val="1010"/>
         </w:numPr>
-      </w:pPr>
-      <w:hyperlink r:id="rId29">
+        <w:pStyle w:val="Compact"/>
+      </w:pPr>
+      <w:hyperlink r:id="rId36">
         <w:r>
           <w:rPr>
             <w:rStyle w:val="Hyperlink"/>
@@ -599,11 +759,13 @@
         </w:r>
       </w:hyperlink>
     </w:p>
-    <w:bookmarkEnd w:id="30"/>
+    <w:bookmarkEnd w:id="37"/>
     <w:sectPr>
       <w:footnotePr>
         <w:numRestart w:val="eachSect"/>
       </w:footnotePr>
+      <w:pgSz w:h="16838" w:w="11906"/>
+      <w:pgMar w:bottom="1134" w:left="1247" w:right="1247" w:top="1134"/>
     </w:sectPr>
   </w:body>
 </w:document>
@@ -635,14 +797,14 @@
 <file path=word/numbering.xml><?xml version="1.0" encoding="utf-8"?>
 <w:numbering xmlns:w="http://schemas.openxmlformats.org/wordprocessingml/2006/main">
   <w:abstractNum w:abstractNumId="990">
-    <w:nsid w:val="0000A990"/>
+    <w:nsid w:val="A990"/>
     <w:multiLevelType w:val="multilevel"/>
     <w:lvl w:ilvl="0">
       <w:numFmt w:val="bullet"/>
       <w:lvlText w:val=" "/>
       <w:lvlJc w:val="left"/>
       <w:pPr>
-        <w:ind w:left="720" w:hanging="360"/>
+        <w:ind w:left="720" w:hanging="480"/>
       </w:pPr>
     </w:lvl>
     <w:lvl w:ilvl="1">
@@ -650,7 +812,7 @@
       <w:lvlText w:val=" "/>
       <w:lvlJc w:val="left"/>
       <w:pPr>
-        <w:ind w:left="1440" w:hanging="360"/>
+        <w:ind w:left="1440" w:hanging="480"/>
       </w:pPr>
     </w:lvl>
     <w:lvl w:ilvl="2">
@@ -658,7 +820,7 @@
       <w:lvlText w:val=" "/>
       <w:lvlJc w:val="left"/>
       <w:pPr>
-        <w:ind w:left="2160" w:hanging="360"/>
+        <w:ind w:left="2160" w:hanging="480"/>
       </w:pPr>
     </w:lvl>
     <w:lvl w:ilvl="3">
@@ -666,7 +828,7 @@
       <w:lvlText w:val=" "/>
       <w:lvlJc w:val="left"/>
       <w:pPr>
-        <w:ind w:left="2880" w:hanging="360"/>
+        <w:ind w:left="2880" w:hanging="480"/>
       </w:pPr>
     </w:lvl>
     <w:lvl w:ilvl="4">
@@ -674,7 +836,7 @@
       <w:lvlText w:val=" "/>
       <w:lvlJc w:val="left"/>
       <w:pPr>
-        <w:ind w:left="3600" w:hanging="360"/>
+        <w:ind w:left="3600" w:hanging="480"/>
       </w:pPr>
     </w:lvl>
     <w:lvl w:ilvl="5">
@@ -682,7 +844,7 @@
       <w:lvlText w:val=" "/>
       <w:lvlJc w:val="left"/>
       <w:pPr>
-        <w:ind w:left="4320" w:hanging="360"/>
+        <w:ind w:left="4320" w:hanging="480"/>
       </w:pPr>
     </w:lvl>
     <w:lvl w:ilvl="6">
@@ -690,7 +852,7 @@
       <w:lvlText w:val=" "/>
       <w:lvlJc w:val="left"/>
       <w:pPr>
-        <w:ind w:left="5040" w:hanging="360"/>
+        <w:ind w:left="5040" w:hanging="480"/>
       </w:pPr>
     </w:lvl>
     <w:lvl w:ilvl="7">
@@ -698,7 +860,7 @@
       <w:lvlText w:val=" "/>
       <w:lvlJc w:val="left"/>
       <w:pPr>
-        <w:ind w:left="5760" w:hanging="360"/>
+        <w:ind w:left="5760" w:hanging="480"/>
       </w:pPr>
     </w:lvl>
     <w:lvl w:ilvl="8">
@@ -706,12 +868,12 @@
       <w:lvlText w:val=" "/>
       <w:lvlJc w:val="left"/>
       <w:pPr>
-        <w:ind w:left="6480" w:hanging="360"/>
+        <w:ind w:left="6480" w:hanging="480"/>
       </w:pPr>
     </w:lvl>
   </w:abstractNum>
   <w:abstractNum w:abstractNumId="99411">
-    <w:nsid w:val="00A99411"/>
+    <w:nsid w:val="A99411"/>
     <w:multiLevelType w:val="multilevel"/>
     <w:lvl w:ilvl="0">
       <w:start w:val="1"/>
@@ -719,7 +881,7 @@
       <w:lvlText w:val="%1."/>
       <w:lvlJc w:val="left"/>
       <w:pPr>
-        <w:ind w:left="720" w:hanging="360"/>
+        <w:ind w:left="720" w:hanging="480"/>
       </w:pPr>
     </w:lvl>
     <w:lvl w:ilvl="1">
@@ -728,7 +890,7 @@
       <w:lvlText w:val="%2."/>
       <w:lvlJc w:val="left"/>
       <w:pPr>
-        <w:ind w:left="1440" w:hanging="360"/>
+        <w:ind w:left="1440" w:hanging="480"/>
       </w:pPr>
     </w:lvl>
     <w:lvl w:ilvl="2">
@@ -737,7 +899,7 @@
       <w:lvlText w:val="%3."/>
       <w:lvlJc w:val="left"/>
       <w:pPr>
-        <w:ind w:left="2160" w:hanging="360"/>
+        <w:ind w:left="2160" w:hanging="480"/>
       </w:pPr>
     </w:lvl>
     <w:lvl w:ilvl="3">
@@ -746,7 +908,7 @@
       <w:lvlText w:val="%4."/>
       <w:lvlJc w:val="left"/>
       <w:pPr>
-        <w:ind w:left="2880" w:hanging="360"/>
+        <w:ind w:left="2880" w:hanging="480"/>
       </w:pPr>
     </w:lvl>
     <w:lvl w:ilvl="4">
@@ -755,7 +917,7 @@
       <w:lvlText w:val="%5."/>
       <w:lvlJc w:val="left"/>
       <w:pPr>
-        <w:ind w:left="3600" w:hanging="360"/>
+        <w:ind w:left="3600" w:hanging="480"/>
       </w:pPr>
     </w:lvl>
     <w:lvl w:ilvl="5">
@@ -764,7 +926,7 @@
       <w:lvlText w:val="%6."/>
       <w:lvlJc w:val="left"/>
       <w:pPr>
-        <w:ind w:left="4320" w:hanging="360"/>
+        <w:ind w:left="4320" w:hanging="480"/>
       </w:pPr>
     </w:lvl>
     <w:lvl w:ilvl="6">
@@ -773,7 +935,7 @@
       <w:lvlText w:val="%7."/>
       <w:lvlJc w:val="left"/>
       <w:pPr>
-        <w:ind w:left="5040" w:hanging="360"/>
+        <w:ind w:left="5040" w:hanging="480"/>
       </w:pPr>
     </w:lvl>
     <w:lvl w:ilvl="7">
@@ -782,7 +944,7 @@
       <w:lvlText w:val="%8."/>
       <w:lvlJc w:val="left"/>
       <w:pPr>
-        <w:ind w:left="5760" w:hanging="360"/>
+        <w:ind w:left="5760" w:hanging="480"/>
       </w:pPr>
     </w:lvl>
     <w:lvl w:ilvl="8">
@@ -791,12 +953,12 @@
       <w:lvlText w:val="%9."/>
       <w:lvlJc w:val="left"/>
       <w:pPr>
-        <w:ind w:left="6480" w:hanging="360"/>
+        <w:ind w:left="6480" w:hanging="480"/>
       </w:pPr>
     </w:lvl>
   </w:abstractNum>
   <w:abstractNum w:abstractNumId="99413">
-    <w:nsid w:val="00A99413"/>
+    <w:nsid w:val="A99413"/>
     <w:multiLevelType w:val="multilevel"/>
     <w:lvl w:ilvl="0">
       <w:start w:val="3"/>
@@ -804,7 +966,7 @@
       <w:lvlText w:val="%1."/>
       <w:lvlJc w:val="left"/>
       <w:pPr>
-        <w:ind w:left="720" w:hanging="360"/>
+        <w:ind w:left="720" w:hanging="480"/>
       </w:pPr>
     </w:lvl>
     <w:lvl w:ilvl="1">
@@ -813,7 +975,7 @@
       <w:lvlText w:val="%2."/>
       <w:lvlJc w:val="left"/>
       <w:pPr>
-        <w:ind w:left="1440" w:hanging="360"/>
+        <w:ind w:left="1440" w:hanging="480"/>
       </w:pPr>
     </w:lvl>
     <w:lvl w:ilvl="2">
@@ -822,7 +984,7 @@
       <w:lvlText w:val="%3."/>
       <w:lvlJc w:val="left"/>
       <w:pPr>
-        <w:ind w:left="2160" w:hanging="360"/>
+        <w:ind w:left="2160" w:hanging="480"/>
       </w:pPr>
     </w:lvl>
     <w:lvl w:ilvl="3">
@@ -831,7 +993,7 @@
       <w:lvlText w:val="%4."/>
       <w:lvlJc w:val="left"/>
       <w:pPr>
-        <w:ind w:left="2880" w:hanging="360"/>
+        <w:ind w:left="2880" w:hanging="480"/>
       </w:pPr>
     </w:lvl>
     <w:lvl w:ilvl="4">
@@ -840,7 +1002,7 @@
       <w:lvlText w:val="%5."/>
       <w:lvlJc w:val="left"/>
       <w:pPr>
-        <w:ind w:left="3600" w:hanging="360"/>
+        <w:ind w:left="3600" w:hanging="480"/>
       </w:pPr>
     </w:lvl>
     <w:lvl w:ilvl="5">
@@ -849,7 +1011,7 @@
       <w:lvlText w:val="%6."/>
       <w:lvlJc w:val="left"/>
       <w:pPr>
-        <w:ind w:left="4320" w:hanging="360"/>
+        <w:ind w:left="4320" w:hanging="480"/>
       </w:pPr>
     </w:lvl>
     <w:lvl w:ilvl="6">
@@ -858,7 +1020,7 @@
       <w:lvlText w:val="%7."/>
       <w:lvlJc w:val="left"/>
       <w:pPr>
-        <w:ind w:left="5040" w:hanging="360"/>
+        <w:ind w:left="5040" w:hanging="480"/>
       </w:pPr>
     </w:lvl>
     <w:lvl w:ilvl="7">
@@ -867,7 +1029,7 @@
       <w:lvlText w:val="%8."/>
       <w:lvlJc w:val="left"/>
       <w:pPr>
-        <w:ind w:left="5760" w:hanging="360"/>
+        <w:ind w:left="5760" w:hanging="480"/>
       </w:pPr>
     </w:lvl>
     <w:lvl w:ilvl="8">
@@ -876,12 +1038,12 @@
       <w:lvlText w:val="%9."/>
       <w:lvlJc w:val="left"/>
       <w:pPr>
-        <w:ind w:left="6480" w:hanging="360"/>
+        <w:ind w:left="6480" w:hanging="480"/>
       </w:pPr>
     </w:lvl>
   </w:abstractNum>
   <w:abstractNum w:abstractNumId="99414">
-    <w:nsid w:val="00A99414"/>
+    <w:nsid w:val="A99414"/>
     <w:multiLevelType w:val="multilevel"/>
     <w:lvl w:ilvl="0">
       <w:start w:val="4"/>
@@ -889,7 +1051,7 @@
       <w:lvlText w:val="%1."/>
       <w:lvlJc w:val="left"/>
       <w:pPr>
-        <w:ind w:left="720" w:hanging="360"/>
+        <w:ind w:left="720" w:hanging="480"/>
       </w:pPr>
     </w:lvl>
     <w:lvl w:ilvl="1">
@@ -898,7 +1060,7 @@
       <w:lvlText w:val="%2."/>
       <w:lvlJc w:val="left"/>
       <w:pPr>
-        <w:ind w:left="1440" w:hanging="360"/>
+        <w:ind w:left="1440" w:hanging="480"/>
       </w:pPr>
     </w:lvl>
     <w:lvl w:ilvl="2">
@@ -907,7 +1069,7 @@
       <w:lvlText w:val="%3."/>
       <w:lvlJc w:val="left"/>
       <w:pPr>
-        <w:ind w:left="2160" w:hanging="360"/>
+        <w:ind w:left="2160" w:hanging="480"/>
       </w:pPr>
     </w:lvl>
     <w:lvl w:ilvl="3">
@@ -916,7 +1078,7 @@
       <w:lvlText w:val="%4."/>
       <w:lvlJc w:val="left"/>
       <w:pPr>
-        <w:ind w:left="2880" w:hanging="360"/>
+        <w:ind w:left="2880" w:hanging="480"/>
       </w:pPr>
     </w:lvl>
     <w:lvl w:ilvl="4">
@@ -925,7 +1087,7 @@
       <w:lvlText w:val="%5."/>
       <w:lvlJc w:val="left"/>
       <w:pPr>
-        <w:ind w:left="3600" w:hanging="360"/>
+        <w:ind w:left="3600" w:hanging="480"/>
       </w:pPr>
     </w:lvl>
     <w:lvl w:ilvl="5">
@@ -934,7 +1096,7 @@
       <w:lvlText w:val="%6."/>
       <w:lvlJc w:val="left"/>
       <w:pPr>
-        <w:ind w:left="4320" w:hanging="360"/>
+        <w:ind w:left="4320" w:hanging="480"/>
       </w:pPr>
     </w:lvl>
     <w:lvl w:ilvl="6">
@@ -943,7 +1105,7 @@
       <w:lvlText w:val="%7."/>
       <w:lvlJc w:val="left"/>
       <w:pPr>
-        <w:ind w:left="5040" w:hanging="360"/>
+        <w:ind w:left="5040" w:hanging="480"/>
       </w:pPr>
     </w:lvl>
     <w:lvl w:ilvl="7">
@@ -952,7 +1114,7 @@
       <w:lvlText w:val="%8."/>
       <w:lvlJc w:val="left"/>
       <w:pPr>
-        <w:ind w:left="5760" w:hanging="360"/>
+        <w:ind w:left="5760" w:hanging="480"/>
       </w:pPr>
     </w:lvl>
     <w:lvl w:ilvl="8">
@@ -961,12 +1123,12 @@
       <w:lvlText w:val="%9."/>
       <w:lvlJc w:val="left"/>
       <w:pPr>
-        <w:ind w:left="6480" w:hanging="360"/>
+        <w:ind w:left="6480" w:hanging="480"/>
       </w:pPr>
     </w:lvl>
   </w:abstractNum>
   <w:abstractNum w:abstractNumId="99415">
-    <w:nsid w:val="00A99415"/>
+    <w:nsid w:val="A99415"/>
     <w:multiLevelType w:val="multilevel"/>
     <w:lvl w:ilvl="0">
       <w:start w:val="5"/>
@@ -974,7 +1136,7 @@
       <w:lvlText w:val="%1."/>
       <w:lvlJc w:val="left"/>
       <w:pPr>
-        <w:ind w:left="720" w:hanging="360"/>
+        <w:ind w:left="720" w:hanging="480"/>
       </w:pPr>
     </w:lvl>
     <w:lvl w:ilvl="1">
@@ -983,7 +1145,7 @@
       <w:lvlText w:val="%2."/>
       <w:lvlJc w:val="left"/>
       <w:pPr>
-        <w:ind w:left="1440" w:hanging="360"/>
+        <w:ind w:left="1440" w:hanging="480"/>
       </w:pPr>
     </w:lvl>
     <w:lvl w:ilvl="2">
@@ -992,7 +1154,7 @@
       <w:lvlText w:val="%3."/>
       <w:lvlJc w:val="left"/>
       <w:pPr>
-        <w:ind w:left="2160" w:hanging="360"/>
+        <w:ind w:left="2160" w:hanging="480"/>
       </w:pPr>
     </w:lvl>
     <w:lvl w:ilvl="3">
@@ -1001,7 +1163,7 @@
       <w:lvlText w:val="%4."/>
       <w:lvlJc w:val="left"/>
       <w:pPr>
-        <w:ind w:left="2880" w:hanging="360"/>
+        <w:ind w:left="2880" w:hanging="480"/>
       </w:pPr>
     </w:lvl>
     <w:lvl w:ilvl="4">
@@ -1010,7 +1172,7 @@
       <w:lvlText w:val="%5."/>
       <w:lvlJc w:val="left"/>
       <w:pPr>
-        <w:ind w:left="3600" w:hanging="360"/>
+        <w:ind w:left="3600" w:hanging="480"/>
       </w:pPr>
     </w:lvl>
     <w:lvl w:ilvl="5">
@@ -1019,7 +1181,7 @@
       <w:lvlText w:val="%6."/>
       <w:lvlJc w:val="left"/>
       <w:pPr>
-        <w:ind w:left="4320" w:hanging="360"/>
+        <w:ind w:left="4320" w:hanging="480"/>
       </w:pPr>
     </w:lvl>
     <w:lvl w:ilvl="6">
@@ -1028,7 +1190,7 @@
       <w:lvlText w:val="%7."/>
       <w:lvlJc w:val="left"/>
       <w:pPr>
-        <w:ind w:left="5040" w:hanging="360"/>
+        <w:ind w:left="5040" w:hanging="480"/>
       </w:pPr>
     </w:lvl>
     <w:lvl w:ilvl="7">
@@ -1037,7 +1199,7 @@
       <w:lvlText w:val="%8."/>
       <w:lvlJc w:val="left"/>
       <w:pPr>
-        <w:ind w:left="5760" w:hanging="360"/>
+        <w:ind w:left="5760" w:hanging="480"/>
       </w:pPr>
     </w:lvl>
     <w:lvl w:ilvl="8">
@@ -1046,12 +1208,12 @@
       <w:lvlText w:val="%9."/>
       <w:lvlJc w:val="left"/>
       <w:pPr>
-        <w:ind w:left="6480" w:hanging="360"/>
+        <w:ind w:left="6480" w:hanging="480"/>
       </w:pPr>
     </w:lvl>
   </w:abstractNum>
   <w:abstractNum w:abstractNumId="99416">
-    <w:nsid w:val="00A99416"/>
+    <w:nsid w:val="A99416"/>
     <w:multiLevelType w:val="multilevel"/>
     <w:lvl w:ilvl="0">
       <w:start w:val="6"/>
@@ -1059,7 +1221,7 @@
       <w:lvlText w:val="%1."/>
       <w:lvlJc w:val="left"/>
       <w:pPr>
-        <w:ind w:left="720" w:hanging="360"/>
+        <w:ind w:left="720" w:hanging="480"/>
       </w:pPr>
     </w:lvl>
     <w:lvl w:ilvl="1">
@@ -1068,7 +1230,7 @@
       <w:lvlText w:val="%2."/>
       <w:lvlJc w:val="left"/>
       <w:pPr>
-        <w:ind w:left="1440" w:hanging="360"/>
+        <w:ind w:left="1440" w:hanging="480"/>
       </w:pPr>
     </w:lvl>
     <w:lvl w:ilvl="2">
@@ -1077,7 +1239,7 @@
       <w:lvlText w:val="%3."/>
       <w:lvlJc w:val="left"/>
       <w:pPr>
-        <w:ind w:left="2160" w:hanging="360"/>
+        <w:ind w:left="2160" w:hanging="480"/>
       </w:pPr>
     </w:lvl>
     <w:lvl w:ilvl="3">
@@ -1086,7 +1248,7 @@
       <w:lvlText w:val="%4."/>
       <w:lvlJc w:val="left"/>
       <w:pPr>
-        <w:ind w:left="2880" w:hanging="360"/>
+        <w:ind w:left="2880" w:hanging="480"/>
       </w:pPr>
     </w:lvl>
     <w:lvl w:ilvl="4">
@@ -1095,7 +1257,7 @@
       <w:lvlText w:val="%5."/>
       <w:lvlJc w:val="left"/>
       <w:pPr>
-        <w:ind w:left="3600" w:hanging="360"/>
+        <w:ind w:left="3600" w:hanging="480"/>
       </w:pPr>
     </w:lvl>
     <w:lvl w:ilvl="5">
@@ -1104,7 +1266,7 @@
       <w:lvlText w:val="%6."/>
       <w:lvlJc w:val="left"/>
       <w:pPr>
-        <w:ind w:left="4320" w:hanging="360"/>
+        <w:ind w:left="4320" w:hanging="480"/>
       </w:pPr>
     </w:lvl>
     <w:lvl w:ilvl="6">
@@ -1113,7 +1275,7 @@
       <w:lvlText w:val="%7."/>
       <w:lvlJc w:val="left"/>
       <w:pPr>
-        <w:ind w:left="5040" w:hanging="360"/>
+        <w:ind w:left="5040" w:hanging="480"/>
       </w:pPr>
     </w:lvl>
     <w:lvl w:ilvl="7">
@@ -1122,7 +1284,7 @@
       <w:lvlText w:val="%8."/>
       <w:lvlJc w:val="left"/>
       <w:pPr>
-        <w:ind w:left="5760" w:hanging="360"/>
+        <w:ind w:left="5760" w:hanging="480"/>
       </w:pPr>
     </w:lvl>
     <w:lvl w:ilvl="8">
@@ -1131,12 +1293,12 @@
       <w:lvlText w:val="%9."/>
       <w:lvlJc w:val="left"/>
       <w:pPr>
-        <w:ind w:left="6480" w:hanging="360"/>
+        <w:ind w:left="6480" w:hanging="480"/>
       </w:pPr>
     </w:lvl>
   </w:abstractNum>
   <w:abstractNum w:abstractNumId="99417">
-    <w:nsid w:val="00A99417"/>
+    <w:nsid w:val="A99417"/>
     <w:multiLevelType w:val="multilevel"/>
     <w:lvl w:ilvl="0">
       <w:start w:val="7"/>
@@ -1144,7 +1306,7 @@
       <w:lvlText w:val="%1."/>
       <w:lvlJc w:val="left"/>
       <w:pPr>
-        <w:ind w:left="720" w:hanging="360"/>
+        <w:ind w:left="720" w:hanging="480"/>
       </w:pPr>
     </w:lvl>
     <w:lvl w:ilvl="1">
@@ -1153,7 +1315,7 @@
       <w:lvlText w:val="%2."/>
       <w:lvlJc w:val="left"/>
       <w:pPr>
-        <w:ind w:left="1440" w:hanging="360"/>
+        <w:ind w:left="1440" w:hanging="480"/>
       </w:pPr>
     </w:lvl>
     <w:lvl w:ilvl="2">
@@ -1162,7 +1324,7 @@
       <w:lvlText w:val="%3."/>
       <w:lvlJc w:val="left"/>
       <w:pPr>
-        <w:ind w:left="2160" w:hanging="360"/>
+        <w:ind w:left="2160" w:hanging="480"/>
       </w:pPr>
     </w:lvl>
     <w:lvl w:ilvl="3">
@@ -1171,7 +1333,7 @@
       <w:lvlText w:val="%4."/>
       <w:lvlJc w:val="left"/>
       <w:pPr>
-        <w:ind w:left="2880" w:hanging="360"/>
+        <w:ind w:left="2880" w:hanging="480"/>
       </w:pPr>
     </w:lvl>
     <w:lvl w:ilvl="4">
@@ -1180,7 +1342,7 @@
       <w:lvlText w:val="%5."/>
       <w:lvlJc w:val="left"/>
       <w:pPr>
-        <w:ind w:left="3600" w:hanging="360"/>
+        <w:ind w:left="3600" w:hanging="480"/>
       </w:pPr>
     </w:lvl>
     <w:lvl w:ilvl="5">
@@ -1189,7 +1351,7 @@
       <w:lvlText w:val="%6."/>
       <w:lvlJc w:val="left"/>
       <w:pPr>
-        <w:ind w:left="4320" w:hanging="360"/>
+        <w:ind w:left="4320" w:hanging="480"/>
       </w:pPr>
     </w:lvl>
     <w:lvl w:ilvl="6">
@@ -1198,7 +1360,7 @@
       <w:lvlText w:val="%7."/>
       <w:lvlJc w:val="left"/>
       <w:pPr>
-        <w:ind w:left="5040" w:hanging="360"/>
+        <w:ind w:left="5040" w:hanging="480"/>
       </w:pPr>
     </w:lvl>
     <w:lvl w:ilvl="7">
@@ -1207,7 +1369,7 @@
       <w:lvlText w:val="%8."/>
       <w:lvlJc w:val="left"/>
       <w:pPr>
-        <w:ind w:left="5760" w:hanging="360"/>
+        <w:ind w:left="5760" w:hanging="480"/>
       </w:pPr>
     </w:lvl>
     <w:lvl w:ilvl="8">
@@ -1216,12 +1378,12 @@
       <w:lvlText w:val="%9."/>
       <w:lvlJc w:val="left"/>
       <w:pPr>
-        <w:ind w:left="6480" w:hanging="360"/>
+        <w:ind w:left="6480" w:hanging="480"/>
       </w:pPr>
     </w:lvl>
   </w:abstractNum>
   <w:abstractNum w:abstractNumId="99418">
-    <w:nsid w:val="00A99418"/>
+    <w:nsid w:val="A99418"/>
     <w:multiLevelType w:val="multilevel"/>
     <w:lvl w:ilvl="0">
       <w:start w:val="8"/>
@@ -1229,7 +1391,7 @@
       <w:lvlText w:val="%1."/>
       <w:lvlJc w:val="left"/>
       <w:pPr>
-        <w:ind w:left="720" w:hanging="360"/>
+        <w:ind w:left="720" w:hanging="480"/>
       </w:pPr>
     </w:lvl>
     <w:lvl w:ilvl="1">
@@ -1238,7 +1400,7 @@
       <w:lvlText w:val="%2."/>
       <w:lvlJc w:val="left"/>
       <w:pPr>
-        <w:ind w:left="1440" w:hanging="360"/>
+        <w:ind w:left="1440" w:hanging="480"/>
       </w:pPr>
     </w:lvl>
     <w:lvl w:ilvl="2">
@@ -1247,7 +1409,7 @@
       <w:lvlText w:val="%3."/>
       <w:lvlJc w:val="left"/>
       <w:pPr>
-        <w:ind w:left="2160" w:hanging="360"/>
+        <w:ind w:left="2160" w:hanging="480"/>
       </w:pPr>
     </w:lvl>
     <w:lvl w:ilvl="3">
@@ -1256,7 +1418,7 @@
       <w:lvlText w:val="%4."/>
       <w:lvlJc w:val="left"/>
       <w:pPr>
-        <w:ind w:left="2880" w:hanging="360"/>
+        <w:ind w:left="2880" w:hanging="480"/>
       </w:pPr>
     </w:lvl>
     <w:lvl w:ilvl="4">
@@ -1265,7 +1427,7 @@
       <w:lvlText w:val="%5."/>
       <w:lvlJc w:val="left"/>
       <w:pPr>
-        <w:ind w:left="3600" w:hanging="360"/>
+        <w:ind w:left="3600" w:hanging="480"/>
       </w:pPr>
     </w:lvl>
     <w:lvl w:ilvl="5">
@@ -1274,7 +1436,7 @@
       <w:lvlText w:val="%6."/>
       <w:lvlJc w:val="left"/>
       <w:pPr>
-        <w:ind w:left="4320" w:hanging="360"/>
+        <w:ind w:left="4320" w:hanging="480"/>
       </w:pPr>
     </w:lvl>
     <w:lvl w:ilvl="6">
@@ -1283,7 +1445,7 @@
       <w:lvlText w:val="%7."/>
       <w:lvlJc w:val="left"/>
       <w:pPr>
-        <w:ind w:left="5040" w:hanging="360"/>
+        <w:ind w:left="5040" w:hanging="480"/>
       </w:pPr>
     </w:lvl>
     <w:lvl w:ilvl="7">
@@ -1292,7 +1454,7 @@
       <w:lvlText w:val="%8."/>
       <w:lvlJc w:val="left"/>
       <w:pPr>
-        <w:ind w:left="5760" w:hanging="360"/>
+        <w:ind w:left="5760" w:hanging="480"/>
       </w:pPr>
     </w:lvl>
     <w:lvl w:ilvl="8">
@@ -1301,12 +1463,12 @@
       <w:lvlText w:val="%9."/>
       <w:lvlJc w:val="left"/>
       <w:pPr>
-        <w:ind w:left="6480" w:hanging="360"/>
+        <w:ind w:left="6480" w:hanging="480"/>
       </w:pPr>
     </w:lvl>
   </w:abstractNum>
   <w:abstractNum w:abstractNumId="99419">
-    <w:nsid w:val="00A99419"/>
+    <w:nsid w:val="A99419"/>
     <w:multiLevelType w:val="multilevel"/>
     <w:lvl w:ilvl="0">
       <w:start w:val="9"/>
@@ -1314,7 +1476,7 @@
       <w:lvlText w:val="%1."/>
       <w:lvlJc w:val="left"/>
       <w:pPr>
-        <w:ind w:left="720" w:hanging="360"/>
+        <w:ind w:left="720" w:hanging="480"/>
       </w:pPr>
     </w:lvl>
     <w:lvl w:ilvl="1">
@@ -1323,7 +1485,7 @@
       <w:lvlText w:val="%2."/>
       <w:lvlJc w:val="left"/>
       <w:pPr>
-        <w:ind w:left="1440" w:hanging="360"/>
+        <w:ind w:left="1440" w:hanging="480"/>
       </w:pPr>
     </w:lvl>
     <w:lvl w:ilvl="2">
@@ -1332,7 +1494,7 @@
       <w:lvlText w:val="%3."/>
       <w:lvlJc w:val="left"/>
       <w:pPr>
-        <w:ind w:left="2160" w:hanging="360"/>
+        <w:ind w:left="2160" w:hanging="480"/>
       </w:pPr>
     </w:lvl>
     <w:lvl w:ilvl="3">
@@ -1341,7 +1503,7 @@
       <w:lvlText w:val="%4."/>
       <w:lvlJc w:val="left"/>
       <w:pPr>
-        <w:ind w:left="2880" w:hanging="360"/>
+        <w:ind w:left="2880" w:hanging="480"/>
       </w:pPr>
     </w:lvl>
     <w:lvl w:ilvl="4">
@@ -1350,7 +1512,7 @@
       <w:lvlText w:val="%5."/>
       <w:lvlJc w:val="left"/>
       <w:pPr>
-        <w:ind w:left="3600" w:hanging="360"/>
+        <w:ind w:left="3600" w:hanging="480"/>
       </w:pPr>
     </w:lvl>
     <w:lvl w:ilvl="5">
@@ -1359,7 +1521,7 @@
       <w:lvlText w:val="%6."/>
       <w:lvlJc w:val="left"/>
       <w:pPr>
-        <w:ind w:left="4320" w:hanging="360"/>
+        <w:ind w:left="4320" w:hanging="480"/>
       </w:pPr>
     </w:lvl>
     <w:lvl w:ilvl="6">
@@ -1368,7 +1530,7 @@
       <w:lvlText w:val="%7."/>
       <w:lvlJc w:val="left"/>
       <w:pPr>
-        <w:ind w:left="5040" w:hanging="360"/>
+        <w:ind w:left="5040" w:hanging="480"/>
       </w:pPr>
     </w:lvl>
     <w:lvl w:ilvl="7">
@@ -1377,7 +1539,7 @@
       <w:lvlText w:val="%8."/>
       <w:lvlJc w:val="left"/>
       <w:pPr>
-        <w:ind w:left="5760" w:hanging="360"/>
+        <w:ind w:left="5760" w:hanging="480"/>
       </w:pPr>
     </w:lvl>
     <w:lvl w:ilvl="8">
@@ -1386,12 +1548,12 @@
       <w:lvlText w:val="%9."/>
       <w:lvlJc w:val="left"/>
       <w:pPr>
-        <w:ind w:left="6480" w:hanging="360"/>
+        <w:ind w:left="6480" w:hanging="480"/>
       </w:pPr>
     </w:lvl>
   </w:abstractNum>
   <w:abstractNum w:abstractNumId="994110">
-    <w:nsid w:val="0A994110"/>
+    <w:nsid w:val="A994110"/>
     <w:multiLevelType w:val="multilevel"/>
     <w:lvl w:ilvl="0">
       <w:start w:val="10"/>
@@ -1399,7 +1561,7 @@
       <w:lvlText w:val="%1."/>
       <w:lvlJc w:val="left"/>
       <w:pPr>
-        <w:ind w:left="720" w:hanging="360"/>
+        <w:ind w:left="720" w:hanging="480"/>
       </w:pPr>
     </w:lvl>
     <w:lvl w:ilvl="1">
@@ -1408,7 +1570,7 @@
       <w:lvlText w:val="%2."/>
       <w:lvlJc w:val="left"/>
       <w:pPr>
-        <w:ind w:left="1440" w:hanging="360"/>
+        <w:ind w:left="1440" w:hanging="480"/>
       </w:pPr>
     </w:lvl>
     <w:lvl w:ilvl="2">
@@ -1417,7 +1579,7 @@
       <w:lvlText w:val="%3."/>
       <w:lvlJc w:val="left"/>
       <w:pPr>
-        <w:ind w:left="2160" w:hanging="360"/>
+        <w:ind w:left="2160" w:hanging="480"/>
       </w:pPr>
     </w:lvl>
     <w:lvl w:ilvl="3">
@@ -1426,7 +1588,7 @@
       <w:lvlText w:val="%4."/>
       <w:lvlJc w:val="left"/>
       <w:pPr>
-        <w:ind w:left="2880" w:hanging="360"/>
+        <w:ind w:left="2880" w:hanging="480"/>
       </w:pPr>
     </w:lvl>
     <w:lvl w:ilvl="4">
@@ -1435,7 +1597,7 @@
       <w:lvlText w:val="%5."/>
       <w:lvlJc w:val="left"/>
       <w:pPr>
-        <w:ind w:left="3600" w:hanging="360"/>
+        <w:ind w:left="3600" w:hanging="480"/>
       </w:pPr>
     </w:lvl>
     <w:lvl w:ilvl="5">
@@ -1444,7 +1606,7 @@
       <w:lvlText w:val="%6."/>
       <w:lvlJc w:val="left"/>
       <w:pPr>
-        <w:ind w:left="4320" w:hanging="360"/>
+        <w:ind w:left="4320" w:hanging="480"/>
       </w:pPr>
     </w:lvl>
     <w:lvl w:ilvl="6">
@@ -1453,7 +1615,7 @@
       <w:lvlText w:val="%7."/>
       <w:lvlJc w:val="left"/>
       <w:pPr>
-        <w:ind w:left="5040" w:hanging="360"/>
+        <w:ind w:left="5040" w:hanging="480"/>
       </w:pPr>
     </w:lvl>
     <w:lvl w:ilvl="7">
@@ -1462,7 +1624,7 @@
       <w:lvlText w:val="%8."/>
       <w:lvlJc w:val="left"/>
       <w:pPr>
-        <w:ind w:left="5760" w:hanging="360"/>
+        <w:ind w:left="5760" w:hanging="480"/>
       </w:pPr>
     </w:lvl>
     <w:lvl w:ilvl="8">
@@ -1471,7 +1633,7 @@
       <w:lvlText w:val="%9."/>
       <w:lvlJc w:val="left"/>
       <w:pPr>
-        <w:ind w:left="6480" w:hanging="360"/>
+        <w:ind w:left="6480" w:hanging="480"/>
       </w:pPr>
     </w:lvl>
   </w:abstractNum>
@@ -1841,6 +2003,7 @@
     </w:pPr>
     <w:rPr>
       <w:rFonts w:asciiTheme="majorHAnsi" w:cstheme="majorBidi" w:eastAsiaTheme="majorEastAsia" w:hAnsiTheme="majorHAnsi"/>
+      <w:color w:val="000000"/>
       <w:sz w:val="56"/>
       <w:szCs w:val="56"/>
     </w:rPr>
@@ -1872,6 +2035,7 @@
     </w:pPr>
     <w:rPr>
       <w:rFonts w:cstheme="majorBidi" w:eastAsiaTheme="majorEastAsia"/>
+      <w:color w:val="000000"/>
       <w:spacing w:val="15"/>
       <w:sz w:val="28"/>
       <w:szCs w:val="28"/>
@@ -1975,7 +2139,7 @@
     </w:pPr>
     <w:rPr>
       <w:rFonts w:asciiTheme="majorHAnsi" w:cstheme="majorBidi" w:eastAsiaTheme="majorEastAsia" w:hAnsiTheme="majorHAnsi"/>
-      <w:color w:themeColor="accent1" w:themeShade="BF" w:val="0F4761"/>
+      <w:color w:val="000000"/>
       <w:sz w:val="40"/>
       <w:szCs w:val="40"/>
     </w:rPr>
@@ -1998,7 +2162,7 @@
     </w:pPr>
     <w:rPr>
       <w:rFonts w:asciiTheme="majorHAnsi" w:cstheme="majorBidi" w:eastAsiaTheme="majorEastAsia" w:hAnsiTheme="majorHAnsi"/>
-      <w:color w:themeColor="accent1" w:themeShade="BF" w:val="0F4761"/>
+      <w:color w:val="000000"/>
       <w:sz w:val="32"/>
       <w:szCs w:val="32"/>
     </w:rPr>
@@ -2021,7 +2185,7 @@
     </w:pPr>
     <w:rPr>
       <w:rFonts w:cstheme="majorBidi" w:eastAsiaTheme="majorEastAsia"/>
-      <w:color w:themeColor="accent1" w:themeShade="BF" w:val="0F4761"/>
+      <w:color w:val="000000"/>
       <w:sz w:val="28"/>
       <w:szCs w:val="28"/>
     </w:rPr>
@@ -2046,7 +2210,7 @@
       <w:rFonts w:cstheme="majorBidi" w:eastAsiaTheme="majorEastAsia"/>
       <w:i/>
       <w:iCs/>
-      <w:color w:themeColor="accent1" w:themeShade="BF" w:val="0F4761"/>
+      <w:color w:val="000000"/>
     </w:rPr>
   </w:style>
   <w:style w:styleId="Heading5" w:type="paragraph">
@@ -2067,7 +2231,7 @@
     </w:pPr>
     <w:rPr>
       <w:rFonts w:cstheme="majorBidi" w:eastAsiaTheme="majorEastAsia"/>
-      <w:color w:themeColor="accent1" w:themeShade="BF" w:val="0F4761"/>
+      <w:color w:val="000000"/>
     </w:rPr>
   </w:style>
   <w:style w:styleId="Heading6" w:type="paragraph">
@@ -2090,7 +2254,7 @@
       <w:rFonts w:cstheme="majorBidi" w:eastAsiaTheme="majorEastAsia"/>
       <w:i/>
       <w:iCs/>
-      <w:color w:themeColor="text1" w:themeTint="A6" w:val="595959"/>
+      <w:color w:val="000000"/>
     </w:rPr>
   </w:style>
   <w:style w:styleId="Heading7" w:type="paragraph">
@@ -2111,7 +2275,7 @@
     </w:pPr>
     <w:rPr>
       <w:rFonts w:cstheme="majorBidi" w:eastAsiaTheme="majorEastAsia"/>
-      <w:color w:themeColor="text1" w:themeTint="A6" w:val="595959"/>
+      <w:color w:val="000000"/>
     </w:rPr>
   </w:style>
   <w:style w:styleId="Heading8" w:type="paragraph">
@@ -2134,7 +2298,7 @@
       <w:rFonts w:cstheme="majorBidi" w:eastAsiaTheme="majorEastAsia"/>
       <w:i/>
       <w:iCs/>
-      <w:color w:themeColor="text1" w:themeTint="D8" w:val="272727"/>
+      <w:color w:val="000000"/>
     </w:rPr>
   </w:style>
   <w:style w:styleId="Heading9" w:type="paragraph">
@@ -2155,7 +2319,7 @@
     </w:pPr>
     <w:rPr>
       <w:rFonts w:cstheme="majorBidi" w:eastAsiaTheme="majorEastAsia"/>
-      <w:color w:themeColor="text1" w:themeTint="D8" w:val="272727"/>
+      <w:color w:val="000000"/>
     </w:rPr>
   </w:style>
   <w:style w:customStyle="1" w:styleId="Heading1Char" w:type="character">
@@ -2437,266 +2601,266 @@
       <w:color w:themeColor="accent1" w:themeShade="BF" w:val="365F91"/>
     </w:rPr>
   </w:style>
-  <w:style w:type="paragraph" w:customStyle="1" w:styleId="SourceCode">
+  <w:style w:customStyle="1" w:styleId="SourceCode" w:type="paragraph">
     <w:name w:val="Source Code"/>
     <w:basedOn w:val="Normal"/>
     <w:link w:val="VerbatimChar"/>
     <w:pPr>
       <w:wordWrap w:val="off"/>
-      <w:shd w:val="clear" w:fill="f1f3f5"/>
+      <w:shd w:fill="f1f3f5" w:val="clear"/>
     </w:pPr>
   </w:style>
-  <w:style w:type="character" w:customStyle="1" w:styleId="KeywordTok">
+  <w:style w:customStyle="1" w:styleId="KeywordTok" w:type="character">
     <w:name w:val="KeywordTok"/>
     <w:basedOn w:val="VerbatimChar"/>
     <w:rPr>
       <w:b/>
       <w:color w:val="003b4f"/>
-      <w:shd w:val="clear" w:fill="f1f3f5"/>
-    </w:rPr>
-  </w:style>
-  <w:style w:type="character" w:customStyle="1" w:styleId="DataTypeTok">
+      <w:shd w:fill="f1f3f5" w:val="clear"/>
+    </w:rPr>
+  </w:style>
+  <w:style w:customStyle="1" w:styleId="DataTypeTok" w:type="character">
     <w:name w:val="DataTypeTok"/>
     <w:basedOn w:val="VerbatimChar"/>
     <w:rPr>
       <w:color w:val="ad0000"/>
-      <w:shd w:val="clear" w:fill="f1f3f5"/>
-    </w:rPr>
-  </w:style>
-  <w:style w:type="character" w:customStyle="1" w:styleId="DecValTok">
+      <w:shd w:fill="f1f3f5" w:val="clear"/>
+    </w:rPr>
+  </w:style>
+  <w:style w:customStyle="1" w:styleId="DecValTok" w:type="character">
     <w:name w:val="DecValTok"/>
     <w:basedOn w:val="VerbatimChar"/>
     <w:rPr>
       <w:color w:val="ad0000"/>
-      <w:shd w:val="clear" w:fill="f1f3f5"/>
-    </w:rPr>
-  </w:style>
-  <w:style w:type="character" w:customStyle="1" w:styleId="BaseNTok">
+      <w:shd w:fill="f1f3f5" w:val="clear"/>
+    </w:rPr>
+  </w:style>
+  <w:style w:customStyle="1" w:styleId="BaseNTok" w:type="character">
     <w:name w:val="BaseNTok"/>
     <w:basedOn w:val="VerbatimChar"/>
     <w:rPr>
       <w:color w:val="ad0000"/>
-      <w:shd w:val="clear" w:fill="f1f3f5"/>
-    </w:rPr>
-  </w:style>
-  <w:style w:type="character" w:customStyle="1" w:styleId="FloatTok">
+      <w:shd w:fill="f1f3f5" w:val="clear"/>
+    </w:rPr>
+  </w:style>
+  <w:style w:customStyle="1" w:styleId="FloatTok" w:type="character">
     <w:name w:val="FloatTok"/>
     <w:basedOn w:val="VerbatimChar"/>
     <w:rPr>
       <w:color w:val="ad0000"/>
-      <w:shd w:val="clear" w:fill="f1f3f5"/>
-    </w:rPr>
-  </w:style>
-  <w:style w:type="character" w:customStyle="1" w:styleId="ConstantTok">
+      <w:shd w:fill="f1f3f5" w:val="clear"/>
+    </w:rPr>
+  </w:style>
+  <w:style w:customStyle="1" w:styleId="ConstantTok" w:type="character">
     <w:name w:val="ConstantTok"/>
     <w:basedOn w:val="VerbatimChar"/>
     <w:rPr>
       <w:color w:val="8f5902"/>
-      <w:shd w:val="clear" w:fill="f1f3f5"/>
-    </w:rPr>
-  </w:style>
-  <w:style w:type="character" w:customStyle="1" w:styleId="CharTok">
+      <w:shd w:fill="f1f3f5" w:val="clear"/>
+    </w:rPr>
+  </w:style>
+  <w:style w:customStyle="1" w:styleId="CharTok" w:type="character">
     <w:name w:val="CharTok"/>
     <w:basedOn w:val="VerbatimChar"/>
     <w:rPr>
       <w:color w:val="20794d"/>
-      <w:shd w:val="clear" w:fill="f1f3f5"/>
-    </w:rPr>
-  </w:style>
-  <w:style w:type="character" w:customStyle="1" w:styleId="SpecialCharTok">
+      <w:shd w:fill="f1f3f5" w:val="clear"/>
+    </w:rPr>
+  </w:style>
+  <w:style w:customStyle="1" w:styleId="SpecialCharTok" w:type="character">
     <w:name w:val="SpecialCharTok"/>
     <w:basedOn w:val="VerbatimChar"/>
     <w:rPr>
       <w:color w:val="5e5e5e"/>
-      <w:shd w:val="clear" w:fill="f1f3f5"/>
-    </w:rPr>
-  </w:style>
-  <w:style w:type="character" w:customStyle="1" w:styleId="StringTok">
+      <w:shd w:fill="f1f3f5" w:val="clear"/>
+    </w:rPr>
+  </w:style>
+  <w:style w:customStyle="1" w:styleId="StringTok" w:type="character">
     <w:name w:val="StringTok"/>
     <w:basedOn w:val="VerbatimChar"/>
     <w:rPr>
       <w:color w:val="20794d"/>
-      <w:shd w:val="clear" w:fill="f1f3f5"/>
-    </w:rPr>
-  </w:style>
-  <w:style w:type="character" w:customStyle="1" w:styleId="VerbatimStringTok">
+      <w:shd w:fill="f1f3f5" w:val="clear"/>
+    </w:rPr>
+  </w:style>
+  <w:style w:customStyle="1" w:styleId="VerbatimStringTok" w:type="character">
     <w:name w:val="VerbatimStringTok"/>
     <w:basedOn w:val="VerbatimChar"/>
     <w:rPr>
       <w:color w:val="20794d"/>
-      <w:shd w:val="clear" w:fill="f1f3f5"/>
-    </w:rPr>
-  </w:style>
-  <w:style w:type="character" w:customStyle="1" w:styleId="SpecialStringTok">
+      <w:shd w:fill="f1f3f5" w:val="clear"/>
+    </w:rPr>
+  </w:style>
+  <w:style w:customStyle="1" w:styleId="SpecialStringTok" w:type="character">
     <w:name w:val="SpecialStringTok"/>
     <w:basedOn w:val="VerbatimChar"/>
     <w:rPr>
       <w:color w:val="20794d"/>
-      <w:shd w:val="clear" w:fill="f1f3f5"/>
-    </w:rPr>
-  </w:style>
-  <w:style w:type="character" w:customStyle="1" w:styleId="ImportTok">
+      <w:shd w:fill="f1f3f5" w:val="clear"/>
+    </w:rPr>
+  </w:style>
+  <w:style w:customStyle="1" w:styleId="ImportTok" w:type="character">
     <w:name w:val="ImportTok"/>
     <w:basedOn w:val="VerbatimChar"/>
     <w:rPr>
       <w:color w:val="00769e"/>
-      <w:shd w:val="clear" w:fill="f1f3f5"/>
-    </w:rPr>
-  </w:style>
-  <w:style w:type="character" w:customStyle="1" w:styleId="CommentTok">
+      <w:shd w:fill="f1f3f5" w:val="clear"/>
+    </w:rPr>
+  </w:style>
+  <w:style w:customStyle="1" w:styleId="CommentTok" w:type="character">
     <w:name w:val="CommentTok"/>
     <w:basedOn w:val="VerbatimChar"/>
     <w:rPr>
       <w:color w:val="5e5e5e"/>
-      <w:shd w:val="clear" w:fill="f1f3f5"/>
-    </w:rPr>
-  </w:style>
-  <w:style w:type="character" w:customStyle="1" w:styleId="DocumentationTok">
+      <w:shd w:fill="f1f3f5" w:val="clear"/>
+    </w:rPr>
+  </w:style>
+  <w:style w:customStyle="1" w:styleId="DocumentationTok" w:type="character">
     <w:name w:val="DocumentationTok"/>
     <w:basedOn w:val="VerbatimChar"/>
     <w:rPr>
       <w:i/>
       <w:color w:val="5e5e5e"/>
-      <w:shd w:val="clear" w:fill="f1f3f5"/>
-    </w:rPr>
-  </w:style>
-  <w:style w:type="character" w:customStyle="1" w:styleId="AnnotationTok">
+      <w:shd w:fill="f1f3f5" w:val="clear"/>
+    </w:rPr>
+  </w:style>
+  <w:style w:customStyle="1" w:styleId="AnnotationTok" w:type="character">
     <w:name w:val="AnnotationTok"/>
     <w:basedOn w:val="VerbatimChar"/>
     <w:rPr>
       <w:color w:val="5e5e5e"/>
-      <w:shd w:val="clear" w:fill="f1f3f5"/>
-    </w:rPr>
-  </w:style>
-  <w:style w:type="character" w:customStyle="1" w:styleId="CommentVarTok">
+      <w:shd w:fill="f1f3f5" w:val="clear"/>
+    </w:rPr>
+  </w:style>
+  <w:style w:customStyle="1" w:styleId="CommentVarTok" w:type="character">
     <w:name w:val="CommentVarTok"/>
     <w:basedOn w:val="VerbatimChar"/>
     <w:rPr>
       <w:i/>
       <w:color w:val="5e5e5e"/>
-      <w:shd w:val="clear" w:fill="f1f3f5"/>
-    </w:rPr>
-  </w:style>
-  <w:style w:type="character" w:customStyle="1" w:styleId="OtherTok">
+      <w:shd w:fill="f1f3f5" w:val="clear"/>
+    </w:rPr>
+  </w:style>
+  <w:style w:customStyle="1" w:styleId="OtherTok" w:type="character">
     <w:name w:val="OtherTok"/>
     <w:basedOn w:val="VerbatimChar"/>
     <w:rPr>
       <w:color w:val="003b4f"/>
-      <w:shd w:val="clear" w:fill="f1f3f5"/>
-    </w:rPr>
-  </w:style>
-  <w:style w:type="character" w:customStyle="1" w:styleId="FunctionTok">
+      <w:shd w:fill="f1f3f5" w:val="clear"/>
+    </w:rPr>
+  </w:style>
+  <w:style w:customStyle="1" w:styleId="FunctionTok" w:type="character">
     <w:name w:val="FunctionTok"/>
     <w:basedOn w:val="VerbatimChar"/>
     <w:rPr>
       <w:color w:val="4758ab"/>
-      <w:shd w:val="clear" w:fill="f1f3f5"/>
-    </w:rPr>
-  </w:style>
-  <w:style w:type="character" w:customStyle="1" w:styleId="VariableTok">
+      <w:shd w:fill="f1f3f5" w:val="clear"/>
+    </w:rPr>
+  </w:style>
+  <w:style w:customStyle="1" w:styleId="VariableTok" w:type="character">
     <w:name w:val="VariableTok"/>
     <w:basedOn w:val="VerbatimChar"/>
     <w:rPr>
       <w:color w:val="111111"/>
-      <w:shd w:val="clear" w:fill="f1f3f5"/>
-    </w:rPr>
-  </w:style>
-  <w:style w:type="character" w:customStyle="1" w:styleId="ControlFlowTok">
+      <w:shd w:fill="f1f3f5" w:val="clear"/>
+    </w:rPr>
+  </w:style>
+  <w:style w:customStyle="1" w:styleId="ControlFlowTok" w:type="character">
     <w:name w:val="ControlFlowTok"/>
     <w:basedOn w:val="VerbatimChar"/>
     <w:rPr>
       <w:b/>
       <w:color w:val="003b4f"/>
-      <w:shd w:val="clear" w:fill="f1f3f5"/>
-    </w:rPr>
-  </w:style>
-  <w:style w:type="character" w:customStyle="1" w:styleId="OperatorTok">
+      <w:shd w:fill="f1f3f5" w:val="clear"/>
+    </w:rPr>
+  </w:style>
+  <w:style w:customStyle="1" w:styleId="OperatorTok" w:type="character">
     <w:name w:val="OperatorTok"/>
     <w:basedOn w:val="VerbatimChar"/>
     <w:rPr>
       <w:color w:val="5e5e5e"/>
-      <w:shd w:val="clear" w:fill="f1f3f5"/>
-    </w:rPr>
-  </w:style>
-  <w:style w:type="character" w:customStyle="1" w:styleId="BuiltInTok">
+      <w:shd w:fill="f1f3f5" w:val="clear"/>
+    </w:rPr>
+  </w:style>
+  <w:style w:customStyle="1" w:styleId="BuiltInTok" w:type="character">
     <w:name w:val="BuiltInTok"/>
     <w:basedOn w:val="VerbatimChar"/>
     <w:rPr>
       <w:color w:val="003b4f"/>
-      <w:shd w:val="clear" w:fill="f1f3f5"/>
-    </w:rPr>
-  </w:style>
-  <w:style w:type="character" w:customStyle="1" w:styleId="ExtensionTok">
+      <w:shd w:fill="f1f3f5" w:val="clear"/>
+    </w:rPr>
+  </w:style>
+  <w:style w:customStyle="1" w:styleId="ExtensionTok" w:type="character">
     <w:name w:val="ExtensionTok"/>
     <w:basedOn w:val="VerbatimChar"/>
     <w:rPr>
       <w:color w:val="003b4f"/>
-      <w:shd w:val="clear" w:fill="f1f3f5"/>
-    </w:rPr>
-  </w:style>
-  <w:style w:type="character" w:customStyle="1" w:styleId="PreprocessorTok">
+      <w:shd w:fill="f1f3f5" w:val="clear"/>
+    </w:rPr>
+  </w:style>
+  <w:style w:customStyle="1" w:styleId="PreprocessorTok" w:type="character">
     <w:name w:val="PreprocessorTok"/>
     <w:basedOn w:val="VerbatimChar"/>
     <w:rPr>
       <w:color w:val="ad0000"/>
-      <w:shd w:val="clear" w:fill="f1f3f5"/>
-    </w:rPr>
-  </w:style>
-  <w:style w:type="character" w:customStyle="1" w:styleId="AttributeTok">
+      <w:shd w:fill="f1f3f5" w:val="clear"/>
+    </w:rPr>
+  </w:style>
+  <w:style w:customStyle="1" w:styleId="AttributeTok" w:type="character">
     <w:name w:val="AttributeTok"/>
     <w:basedOn w:val="VerbatimChar"/>
     <w:rPr>
       <w:color w:val="657422"/>
-      <w:shd w:val="clear" w:fill="f1f3f5"/>
-    </w:rPr>
-  </w:style>
-  <w:style w:type="character" w:customStyle="1" w:styleId="RegionMarkerTok">
+      <w:shd w:fill="f1f3f5" w:val="clear"/>
+    </w:rPr>
+  </w:style>
+  <w:style w:customStyle="1" w:styleId="RegionMarkerTok" w:type="character">
     <w:name w:val="RegionMarkerTok"/>
     <w:basedOn w:val="VerbatimChar"/>
     <w:rPr>
       <w:color w:val="003b4f"/>
-      <w:shd w:val="clear" w:fill="f1f3f5"/>
-    </w:rPr>
-  </w:style>
-  <w:style w:type="character" w:customStyle="1" w:styleId="InformationTok">
+      <w:shd w:fill="f1f3f5" w:val="clear"/>
+    </w:rPr>
+  </w:style>
+  <w:style w:customStyle="1" w:styleId="InformationTok" w:type="character">
     <w:name w:val="InformationTok"/>
     <w:basedOn w:val="VerbatimChar"/>
     <w:rPr>
       <w:color w:val="5e5e5e"/>
-      <w:shd w:val="clear" w:fill="f1f3f5"/>
-    </w:rPr>
-  </w:style>
-  <w:style w:type="character" w:customStyle="1" w:styleId="WarningTok">
+      <w:shd w:fill="f1f3f5" w:val="clear"/>
+    </w:rPr>
+  </w:style>
+  <w:style w:customStyle="1" w:styleId="WarningTok" w:type="character">
     <w:name w:val="WarningTok"/>
     <w:basedOn w:val="VerbatimChar"/>
     <w:rPr>
       <w:i/>
       <w:color w:val="5e5e5e"/>
-      <w:shd w:val="clear" w:fill="f1f3f5"/>
-    </w:rPr>
-  </w:style>
-  <w:style w:type="character" w:customStyle="1" w:styleId="AlertTok">
+      <w:shd w:fill="f1f3f5" w:val="clear"/>
+    </w:rPr>
+  </w:style>
+  <w:style w:customStyle="1" w:styleId="AlertTok" w:type="character">
     <w:name w:val="AlertTok"/>
     <w:basedOn w:val="VerbatimChar"/>
     <w:rPr>
       <w:color w:val="ad0000"/>
-      <w:shd w:val="clear" w:fill="f1f3f5"/>
-    </w:rPr>
-  </w:style>
-  <w:style w:type="character" w:customStyle="1" w:styleId="ErrorTok">
+      <w:shd w:fill="f1f3f5" w:val="clear"/>
+    </w:rPr>
+  </w:style>
+  <w:style w:customStyle="1" w:styleId="ErrorTok" w:type="character">
     <w:name w:val="ErrorTok"/>
     <w:basedOn w:val="VerbatimChar"/>
     <w:rPr>
       <w:color w:val="ad0000"/>
-      <w:shd w:val="clear" w:fill="f1f3f5"/>
-    </w:rPr>
-  </w:style>
-  <w:style w:type="character" w:customStyle="1" w:styleId="NormalTok">
+      <w:shd w:fill="f1f3f5" w:val="clear"/>
+    </w:rPr>
+  </w:style>
+  <w:style w:customStyle="1" w:styleId="NormalTok" w:type="character">
     <w:name w:val="NormalTok"/>
     <w:basedOn w:val="VerbatimChar"/>
     <w:rPr>
       <w:color w:val="003b4f"/>
-      <w:shd w:val="clear" w:fill="f1f3f5"/>
+      <w:shd w:fill="f1f3f5" w:val="clear"/>
     </w:rPr>
   </w:style>
 </w:styles>

</xml_diff>

<commit_message>
Replace lab 02–05 and 07–08 screenshots with real Arkhipov runs
Use 32 genuine Ubuntu terminal captures in reports and presentations. Match descriptions and code to the recorded results; rebuild PDF, DOCX, HTML and six archives. Preserve lab 06 and theoretical diagrams/tables. Validate image links, original capture hashes, decoded PDF pixels and archive contents.
</commit_message>
<xml_diff>
--- a/labs/lab04/report/infosec-intro--lab04--report.docx
+++ b/labs/lab04/report/infosec-intro--lab04--report.docx
@@ -97,75 +97,43 @@
       <w:r>
         <w:t xml:space="preserve">Сергеевич</w:t>
       </w:r>
-      <w:r>
-        <w:br/>
-      </w:r>
+    </w:p>
+    <w:p>
+      <w:pPr>
+        <w:pStyle w:val="Author"/>
+      </w:pPr>
       <w:r>
         <w:t xml:space="preserve">НБИбд-01-24</w:t>
       </w:r>
-      <w:r>
-        <w:br/>
-      </w:r>
-      <w:r>
-        <w:t xml:space="preserve">Студенческий</w:t>
+    </w:p>
+    <w:p>
+      <w:pPr>
+        <w:pStyle w:val="Author"/>
+      </w:pPr>
+      <w:r>
+        <w:t xml:space="preserve">1132239106</w:t>
       </w:r>
       <w:r>
         <w:t xml:space="preserve"> </w:t>
       </w:r>
       <w:r>
-        <w:t xml:space="preserve">билет</w:t>
+        <w:t xml:space="preserve">|</w:t>
       </w:r>
       <w:r>
         <w:t xml:space="preserve"> </w:t>
       </w:r>
       <w:r>
-        <w:t xml:space="preserve">1132239106</w:t>
-      </w:r>
-      <w:r>
-        <w:br/>
-      </w:r>
-      <w:r>
         <w:t xml:space="preserve">1132239106@rudn.ru</w:t>
       </w:r>
     </w:p>
-    <w:sdt>
-      <w:sdtPr>
-        <w:docPartObj>
-          <w:docPartGallery w:val="Table of Contents"/>
-          <w:docPartUnique/>
-        </w:docPartObj>
-      </w:sdtPr>
-      <w:sdtContent>
-        <w:p>
-          <w:pPr>
-            <w:pStyle w:val="TOCHeading"/>
-          </w:pPr>
-          <w:r>
-            <w:t xml:space="preserve">Содержание</w:t>
-          </w:r>
-        </w:p>
-        <w:p>
-          <w:r>
-            <w:t>Цель работы</w:t>
-          </w:r>
-        </w:p>
-        <w:p>
-          <w:r>
-            <w:t>Выполнение лабораторной работы</w:t>
-          </w:r>
-        </w:p>
-        <w:p>
-          <w:r>
-            <w:t>Выводы</w:t>
-          </w:r>
-        </w:p>
-        <w:p>
-          <w:r>
-            <w:t>Список литературы</w:t>
-          </w:r>
-        </w:p>
-      </w:sdtContent>
-    </w:sdt>
+    <w:p>
+      <w:pPr>
+        <w:pStyle w:val="Date"/>
+      </w:pPr>
+      <w:r>
+        <w:t xml:space="preserve">07.10.2026</w:t>
+      </w:r>
+    </w:p>
     <w:bookmarkStart w:id="20" w:name="цель-работы"/>
     <w:p>
       <w:pPr>
@@ -193,7 +161,7 @@
       </w:r>
     </w:p>
     <w:bookmarkEnd w:id="20"/>
-    <w:bookmarkStart w:id="33" w:name="выполнение-лабораторной-работы"/>
+    <w:bookmarkStart w:id="45" w:name="выполнение-лабораторной-работы"/>
     <w:p>
       <w:pPr>
         <w:pStyle w:val="Heading1"/>
@@ -213,24 +181,36 @@
     </w:p>
     <w:p>
       <w:pPr>
-        <w:numPr>
-          <w:ilvl w:val="0"/>
-          <w:numId w:val="1001"/>
-        </w:numPr>
-      </w:pPr>
-      <w:r>
-        <w:t xml:space="preserve">От имени пользователя guest определите расширенные атрибуты файла /home/guest/dir1/file1 командой lsattr /home/guest/dir1/file1</w:t>
-      </w:r>
-    </w:p>
-    <w:p>
-      <w:pPr>
-        <w:numPr>
-          <w:ilvl w:val="0"/>
-          <w:numId w:val="1001"/>
-        </w:numPr>
-      </w:pPr>
-      <w:r>
-        <w:t xml:space="preserve">Установите командой chmod 600 file1 на файл file1 права, разрешающие чтение и запись для владельца файла.</w:t>
+        <w:pStyle w:val="FirstParagraph"/>
+      </w:pPr>
+      <w:r>
+        <w:t xml:space="preserve">Проверки выполнены на ext4 в Ubuntu 24.04. Установка и снятие a/i выполнены от root, проверки доступа — от guest. В конце оба временных атрибута сняты.</w:t>
+      </w:r>
+    </w:p>
+    <w:bookmarkStart w:id="24" w:name="исходные-атрибуты-и-права-файла"/>
+    <w:p>
+      <w:pPr>
+        <w:pStyle w:val="Heading2"/>
+      </w:pPr>
+      <w:r>
+        <w:rPr>
+          <w:rStyle w:val="SectionNumber"/>
+        </w:rPr>
+        <w:t xml:space="preserve">2.1</w:t>
+      </w:r>
+      <w:r>
+        <w:tab/>
+      </w:r>
+      <w:r>
+        <w:t xml:space="preserve">исходные атрибуты и права файла</w:t>
+      </w:r>
+    </w:p>
+    <w:p>
+      <w:pPr>
+        <w:pStyle w:val="FirstParagraph"/>
+      </w:pPr>
+      <w:r>
+        <w:t xml:space="preserve">Обычный file1 принадлежит guest, режим 600. Атрибут e для ext4 не является append-only или immutable.</w:t>
       </w:r>
     </w:p>
     <w:p>
@@ -240,14 +220,14 @@
       <w:r>
         <w:drawing>
           <wp:inline>
-            <wp:extent cx="4178300" cy="1870430"/>
+            <wp:extent cx="5670550" cy="1331310"/>
             <wp:effectExtent b="0" l="0" r="0" t="0"/>
-            <wp:docPr descr="права доступа" title="" id="22" name="Picture"/>
+            <wp:docPr descr="исходные атрибуты и права файла" title="" id="22" name="Picture"/>
             <a:graphic>
               <a:graphicData uri="http://schemas.openxmlformats.org/drawingml/2006/picture">
                 <pic:pic>
                   <pic:nvPicPr>
-                    <pic:cNvPr descr="image/01.png" id="23" name="Picture"/>
+                    <pic:cNvPr descr="image/01.jpg" id="23" name="Picture"/>
                     <pic:cNvPicPr>
                       <a:picLocks noChangeArrowheads="1" noChangeAspect="1"/>
                     </pic:cNvPicPr>
@@ -261,7 +241,7 @@
                   <pic:spPr bwMode="auto">
                     <a:xfrm>
                       <a:off x="0" y="0"/>
-                      <a:ext cx="4178300" cy="1870430"/>
+                      <a:ext cx="5670550" cy="1331310"/>
                     </a:xfrm>
                     <a:prstGeom prst="rect">
                       <a:avLst/>
@@ -285,19 +265,26 @@
         <w:pStyle w:val="ImageCaption"/>
       </w:pPr>
       <w:r>
-        <w:t xml:space="preserve">права доступа</w:t>
-      </w:r>
-    </w:p>
-    <w:p>
-      <w:pPr>
-        <w:numPr>
-          <w:ilvl w:val="0"/>
-          <w:numId w:val="1002"/>
-        </w:numPr>
-        <w:pStyle w:val="Compact"/>
-      </w:pPr>
-      <w:r>
-        <w:t xml:space="preserve">Попробуйте установить на файл /home/guest/dir1/file1 расширенный атрибут a от имени пользователя guest: chattr +a /home/guest/dir1/file1</w:t>
+        <w:t xml:space="preserve">исходные атрибуты и права файла</w:t>
+      </w:r>
+    </w:p>
+    <w:bookmarkEnd w:id="24"/>
+    <w:bookmarkStart w:id="28" w:name="попытка-установить-a-от-guest"/>
+    <w:p>
+      <w:pPr>
+        <w:pStyle w:val="Heading2"/>
+      </w:pPr>
+      <w:r>
+        <w:rPr>
+          <w:rStyle w:val="SectionNumber"/>
+        </w:rPr>
+        <w:t xml:space="preserve">2.2</w:t>
+      </w:r>
+      <w:r>
+        <w:tab/>
+      </w:r>
+      <w:r>
+        <w:t xml:space="preserve">попытка установить +a от guest</w:t>
       </w:r>
     </w:p>
     <w:p>
@@ -305,166 +292,7 @@
         <w:pStyle w:val="FirstParagraph"/>
       </w:pPr>
       <w:r>
-        <w:t xml:space="preserve">Установка атрибута a требует привилегий. В имеющихся скриншотах показана установка от root; попытка от guest отдельным снимком не подтверждена.</w:t>
-      </w:r>
-    </w:p>
-    <w:p>
-      <w:pPr>
-        <w:numPr>
-          <w:ilvl w:val="0"/>
-          <w:numId w:val="1003"/>
-        </w:numPr>
-        <w:pStyle w:val="Compact"/>
-      </w:pPr>
-      <w:r>
-        <w:t xml:space="preserve">Зайдите на третью консоль с правами администратора либо повысьте свои права с помощью команды su. Попробуйте установить расширенный атрибут a на файл /home/guest/dir1/file1 от имени суперпользователя: chattr +a /home/guest/dir1/file1</w:t>
-      </w:r>
-    </w:p>
-    <w:p>
-      <w:pPr>
-        <w:pStyle w:val="FirstParagraph"/>
-      </w:pPr>
-      <w:r>
-        <w:t xml:space="preserve">Команда выполнилась от имени суперпользователя</w:t>
-      </w:r>
-    </w:p>
-    <w:p>
-      <w:pPr>
-        <w:numPr>
-          <w:ilvl w:val="0"/>
-          <w:numId w:val="1004"/>
-        </w:numPr>
-        <w:pStyle w:val="Compact"/>
-      </w:pPr>
-      <w:r>
-        <w:t xml:space="preserve">От пользователя guest проверьте правильность установления атрибута: lsattr /home/guest/dir1/file1</w:t>
-      </w:r>
-    </w:p>
-    <w:p>
-      <w:pPr>
-        <w:pStyle w:val="FirstParagraph"/>
-      </w:pPr>
-      <w:r>
-        <w:t xml:space="preserve">Атрибут a установлен.</w:t>
-      </w:r>
-    </w:p>
-    <w:p>
-      <w:pPr>
-        <w:numPr>
-          <w:ilvl w:val="0"/>
-          <w:numId w:val="1005"/>
-        </w:numPr>
-        <w:pStyle w:val="Compact"/>
-      </w:pPr>
-      <w:r>
-        <w:t xml:space="preserve">Выполните дозапись в файл file1 слова «test» командой echo</w:t>
-      </w:r>
-      <w:r>
-        <w:t xml:space="preserve"> </w:t>
-      </w:r>
-      <w:r>
-        <w:t xml:space="preserve">“</w:t>
-      </w:r>
-      <w:r>
-        <w:t xml:space="preserve">test</w:t>
-      </w:r>
-      <w:r>
-        <w:t xml:space="preserve">”</w:t>
-      </w:r>
-      <w:r>
-        <w:t xml:space="preserve"> </w:t>
-      </w:r>
-      <w:r>
-        <w:t xml:space="preserve">&gt;&gt; /home/guest/dir1/file1</w:t>
-      </w:r>
-    </w:p>
-    <w:p>
-      <w:pPr>
-        <w:pStyle w:val="FirstParagraph"/>
-      </w:pPr>
-      <w:r>
-        <w:t xml:space="preserve">Дозапись выполнена.</w:t>
-      </w:r>
-    </w:p>
-    <w:p>
-      <w:pPr>
-        <w:pStyle w:val="BodyText"/>
-      </w:pPr>
-      <w:r>
-        <w:t xml:space="preserve">После этого выполните чтение файла file1 командой cat /home/guest/dir1/file1 Файл содержит строку</w:t>
-      </w:r>
-      <w:r>
-        <w:t xml:space="preserve"> </w:t>
-      </w:r>
-      <w:r>
-        <w:t xml:space="preserve">“</w:t>
-      </w:r>
-      <w:r>
-        <w:t xml:space="preserve">test</w:t>
-      </w:r>
-      <w:r>
-        <w:t xml:space="preserve">”</w:t>
-      </w:r>
-      <w:r>
-        <w:t xml:space="preserve">.</w:t>
-      </w:r>
-    </w:p>
-    <w:p>
-      <w:pPr>
-        <w:numPr>
-          <w:ilvl w:val="0"/>
-          <w:numId w:val="1006"/>
-        </w:numPr>
-        <w:pStyle w:val="Compact"/>
-      </w:pPr>
-      <w:r>
-        <w:t xml:space="preserve">Попробуйте удалить файл file1 либо стереть имеющуюся в нём информацию командой echo</w:t>
-      </w:r>
-      <w:r>
-        <w:t xml:space="preserve"> </w:t>
-      </w:r>
-      <w:r>
-        <w:t xml:space="preserve">“</w:t>
-      </w:r>
-      <w:r>
-        <w:t xml:space="preserve">abcd</w:t>
-      </w:r>
-      <w:r>
-        <w:t xml:space="preserve">”</w:t>
-      </w:r>
-      <w:r>
-        <w:t xml:space="preserve"> </w:t>
-      </w:r>
-      <w:r>
-        <w:t xml:space="preserve">&gt; /home/guest/dir1/file1 Попробуйте переименовать файл.</w:t>
-      </w:r>
-    </w:p>
-    <w:p>
-      <w:pPr>
-        <w:pStyle w:val="FirstParagraph"/>
-      </w:pPr>
-      <w:r>
-        <w:t xml:space="preserve">Перезаписать файл не удается, удалить или переименовать тоже.</w:t>
-      </w:r>
-    </w:p>
-    <w:p>
-      <w:pPr>
-        <w:numPr>
-          <w:ilvl w:val="0"/>
-          <w:numId w:val="1007"/>
-        </w:numPr>
-        <w:pStyle w:val="Compact"/>
-      </w:pPr>
-      <w:r>
-        <w:t xml:space="preserve">Попробуйте с помощью команды chmod 000 file1 установить на файл file1 права, например, запрещающие чтение и запись для владельца файла. Удалось ли вам успешно выполнить указанные команды?</w:t>
-      </w:r>
-    </w:p>
-    <w:p>
-      <w:pPr>
-        <w:pStyle w:val="FirstParagraph"/>
-      </w:pPr>
-      <w:r>
-        <w:t xml:space="preserve">Команда изменения прав также не выполняется.</w:t>
+        <w:t xml:space="preserve">guest не обладает правом устанавливать a; Operation not permitted ожидаем.</w:t>
       </w:r>
     </w:p>
     <w:p>
@@ -474,20 +302,20 @@
       <w:r>
         <w:drawing>
           <wp:inline>
-            <wp:extent cx="4178300" cy="2646727"/>
+            <wp:extent cx="5670550" cy="1331310"/>
             <wp:effectExtent b="0" l="0" r="0" t="0"/>
-            <wp:docPr descr="Установленный атрибут a (chattr +a)" title="" id="25" name="Picture"/>
+            <wp:docPr descr="попытка установить +a от guest" title="" id="26" name="Picture"/>
             <a:graphic>
               <a:graphicData uri="http://schemas.openxmlformats.org/drawingml/2006/picture">
                 <pic:pic>
                   <pic:nvPicPr>
-                    <pic:cNvPr descr="image/02.png" id="26" name="Picture"/>
+                    <pic:cNvPr descr="image/02_guest.jpg" id="27" name="Picture"/>
                     <pic:cNvPicPr>
                       <a:picLocks noChangeArrowheads="1" noChangeAspect="1"/>
                     </pic:cNvPicPr>
                   </pic:nvPicPr>
                   <pic:blipFill>
-                    <a:blip r:embed="rId24"/>
+                    <a:blip r:embed="rId25"/>
                     <a:stretch>
                       <a:fillRect/>
                     </a:stretch>
@@ -495,7 +323,7 @@
                   <pic:spPr bwMode="auto">
                     <a:xfrm>
                       <a:off x="0" y="0"/>
-                      <a:ext cx="4178300" cy="2646727"/>
+                      <a:ext cx="5670550" cy="1331310"/>
                     </a:xfrm>
                     <a:prstGeom prst="rect">
                       <a:avLst/>
@@ -519,19 +347,26 @@
         <w:pStyle w:val="ImageCaption"/>
       </w:pPr>
       <w:r>
-        <w:t xml:space="preserve">Установленный атрибут a (chattr +a)</w:t>
-      </w:r>
-    </w:p>
-    <w:p>
-      <w:pPr>
-        <w:numPr>
-          <w:ilvl w:val="0"/>
-          <w:numId w:val="1008"/>
-        </w:numPr>
-        <w:pStyle w:val="Compact"/>
-      </w:pPr>
-      <w:r>
-        <w:t xml:space="preserve">Снимите расширенный атрибут a с файла /home/guest/dir1/file1 от имени суперпользователя командой chattr -a /home/guest/dir1/file1</w:t>
+        <w:t xml:space="preserve">попытка установить +a от guest</w:t>
+      </w:r>
+    </w:p>
+    <w:bookmarkEnd w:id="28"/>
+    <w:bookmarkStart w:id="32" w:name="Xff29a425fa2dd206edc907e6021d0e9edee8ff8"/>
+    <w:p>
+      <w:pPr>
+        <w:pStyle w:val="Heading2"/>
+      </w:pPr>
+      <w:r>
+        <w:rPr>
+          <w:rStyle w:val="SectionNumber"/>
+        </w:rPr>
+        <w:t xml:space="preserve">2.3</w:t>
+      </w:r>
+      <w:r>
+        <w:tab/>
+      </w:r>
+      <w:r>
+        <w:t xml:space="preserve">append-only, установка root и проверки guest</w:t>
       </w:r>
     </w:p>
     <w:p>
@@ -539,23 +374,7 @@
         <w:pStyle w:val="FirstParagraph"/>
       </w:pPr>
       <w:r>
-        <w:t xml:space="preserve">Атрибут снят.</w:t>
-      </w:r>
-    </w:p>
-    <w:p>
-      <w:pPr>
-        <w:pStyle w:val="BodyText"/>
-      </w:pPr>
-      <w:r>
-        <w:t xml:space="preserve">Повторите операции, которые вам ранее не удавалось выполнить. Ваши наблюдения занесите в отчёт.</w:t>
-      </w:r>
-    </w:p>
-    <w:p>
-      <w:pPr>
-        <w:pStyle w:val="BodyText"/>
-      </w:pPr>
-      <w:r>
-        <w:t xml:space="preserve">После снятия атрибута –а стало возможным переписать файл, удалить или переименовать его, а также сменить права. Атрибут a позволяет только дозаписывать файл.</w:t>
+        <w:t xml:space="preserve">После установки a администратором guest может читать и дописывать. Перезапись, mv, chmod и rm запрещены.</w:t>
       </w:r>
     </w:p>
     <w:p>
@@ -565,20 +384,20 @@
       <w:r>
         <w:drawing>
           <wp:inline>
-            <wp:extent cx="4178300" cy="2546371"/>
+            <wp:extent cx="5670550" cy="2080172"/>
             <wp:effectExtent b="0" l="0" r="0" t="0"/>
-            <wp:docPr descr="Атрибут a снят командой chattr -a" title="" id="28" name="Picture"/>
+            <wp:docPr descr="append-only, установка root и проверки guest" title="" id="30" name="Picture"/>
             <a:graphic>
               <a:graphicData uri="http://schemas.openxmlformats.org/drawingml/2006/picture">
                 <pic:pic>
                   <pic:nvPicPr>
-                    <pic:cNvPr descr="image/03.png" id="29" name="Picture"/>
+                    <pic:cNvPr descr="image/02.jpg" id="31" name="Picture"/>
                     <pic:cNvPicPr>
                       <a:picLocks noChangeArrowheads="1" noChangeAspect="1"/>
                     </pic:cNvPicPr>
                   </pic:nvPicPr>
                   <pic:blipFill>
-                    <a:blip r:embed="rId27"/>
+                    <a:blip r:embed="rId29"/>
                     <a:stretch>
                       <a:fillRect/>
                     </a:stretch>
@@ -586,7 +405,7 @@
                   <pic:spPr bwMode="auto">
                     <a:xfrm>
                       <a:off x="0" y="0"/>
-                      <a:ext cx="4178300" cy="2546371"/>
+                      <a:ext cx="5670550" cy="2080172"/>
                     </a:xfrm>
                     <a:prstGeom prst="rect">
                       <a:avLst/>
@@ -610,19 +429,26 @@
         <w:pStyle w:val="ImageCaption"/>
       </w:pPr>
       <w:r>
-        <w:t xml:space="preserve">Атрибут a снят командой chattr -a</w:t>
-      </w:r>
-    </w:p>
-    <w:p>
-      <w:pPr>
-        <w:numPr>
-          <w:ilvl w:val="0"/>
-          <w:numId w:val="1009"/>
-        </w:numPr>
-        <w:pStyle w:val="Compact"/>
-      </w:pPr>
-      <w:r>
-        <w:t xml:space="preserve">Повторите ваши действия по шагам, заменив атрибут «a» атрибутом «i». Удалось ли вам дозаписать информацию в файл? Ваши наблюдения занесите в отчёт.</w:t>
+        <w:t xml:space="preserve">append-only, установка root и проверки guest</w:t>
+      </w:r>
+    </w:p>
+    <w:bookmarkEnd w:id="32"/>
+    <w:bookmarkStart w:id="36" w:name="снятие-a-и-восстановление-операций"/>
+    <w:p>
+      <w:pPr>
+        <w:pStyle w:val="Heading2"/>
+      </w:pPr>
+      <w:r>
+        <w:rPr>
+          <w:rStyle w:val="SectionNumber"/>
+        </w:rPr>
+        <w:t xml:space="preserve">2.4</w:t>
+      </w:r>
+      <w:r>
+        <w:tab/>
+      </w:r>
+      <w:r>
+        <w:t xml:space="preserve">снятие +a и восстановление операций</w:t>
       </w:r>
     </w:p>
     <w:p>
@@ -630,7 +456,7 @@
         <w:pStyle w:val="FirstParagraph"/>
       </w:pPr>
       <w:r>
-        <w:t xml:space="preserve">Атрибут i запрещает любое изменение файла: дозапись, переименование, удаление, смену атрибутов.</w:t>
+        <w:t xml:space="preserve">После -a снова разрешены перезапись, переименование, chmod и удаление. Учебный file1 создан заново.</w:t>
       </w:r>
     </w:p>
     <w:p>
@@ -640,20 +466,20 @@
       <w:r>
         <w:drawing>
           <wp:inline>
-            <wp:extent cx="4178300" cy="2536825"/>
+            <wp:extent cx="5670550" cy="1996965"/>
             <wp:effectExtent b="0" l="0" r="0" t="0"/>
-            <wp:docPr descr="Установленный атрибут i (chattr +i)" title="" id="31" name="Picture"/>
+            <wp:docPr descr="снятие +a и восстановление операций" title="" id="34" name="Picture"/>
             <a:graphic>
               <a:graphicData uri="http://schemas.openxmlformats.org/drawingml/2006/picture">
                 <pic:pic>
                   <pic:nvPicPr>
-                    <pic:cNvPr descr="image/04.png" id="32" name="Picture"/>
+                    <pic:cNvPr descr="image/03.jpg" id="35" name="Picture"/>
                     <pic:cNvPicPr>
                       <a:picLocks noChangeArrowheads="1" noChangeAspect="1"/>
                     </pic:cNvPicPr>
                   </pic:nvPicPr>
                   <pic:blipFill>
-                    <a:blip r:embed="rId30"/>
+                    <a:blip r:embed="rId33"/>
                     <a:stretch>
                       <a:fillRect/>
                     </a:stretch>
@@ -661,7 +487,7 @@
                   <pic:spPr bwMode="auto">
                     <a:xfrm>
                       <a:off x="0" y="0"/>
-                      <a:ext cx="4178300" cy="2536825"/>
+                      <a:ext cx="5670550" cy="1996965"/>
                     </a:xfrm>
                     <a:prstGeom prst="rect">
                       <a:avLst/>
@@ -685,11 +511,176 @@
         <w:pStyle w:val="ImageCaption"/>
       </w:pPr>
       <w:r>
-        <w:t xml:space="preserve">Установленный атрибут i (chattr +i)</w:t>
-      </w:r>
-    </w:p>
-    <w:bookmarkEnd w:id="33"/>
-    <w:bookmarkStart w:id="34" w:name="выводы"/>
+        <w:t xml:space="preserve">снятие +a и восстановление операций</w:t>
+      </w:r>
+    </w:p>
+    <w:bookmarkEnd w:id="36"/>
+    <w:bookmarkStart w:id="40" w:name="immutable-и-запреты-на-изменение"/>
+    <w:p>
+      <w:pPr>
+        <w:pStyle w:val="Heading2"/>
+      </w:pPr>
+      <w:r>
+        <w:rPr>
+          <w:rStyle w:val="SectionNumber"/>
+        </w:rPr>
+        <w:t xml:space="preserve">2.5</w:t>
+      </w:r>
+      <w:r>
+        <w:tab/>
+      </w:r>
+      <w:r>
+        <w:t xml:space="preserve">immutable и запреты на изменение</w:t>
+      </w:r>
+    </w:p>
+    <w:p>
+      <w:pPr>
+        <w:pStyle w:val="FirstParagraph"/>
+      </w:pPr>
+      <w:r>
+        <w:t xml:space="preserve">С i запрещены дозапись, перезапись, mv, chmod и rm. Чтение разрешено. В этой повторной проверке файл содержит test и ранее добавленную строку after -i.</w:t>
+      </w:r>
+    </w:p>
+    <w:p>
+      <w:pPr>
+        <w:pStyle w:val="CaptionedFigure"/>
+      </w:pPr>
+      <w:r>
+        <w:drawing>
+          <wp:inline>
+            <wp:extent cx="5670550" cy="3894082"/>
+            <wp:effectExtent b="0" l="0" r="0" t="0"/>
+            <wp:docPr descr="immutable и запреты на изменение" title="" id="38" name="Picture"/>
+            <a:graphic>
+              <a:graphicData uri="http://schemas.openxmlformats.org/drawingml/2006/picture">
+                <pic:pic>
+                  <pic:nvPicPr>
+                    <pic:cNvPr descr="image/04.jpg" id="39" name="Picture"/>
+                    <pic:cNvPicPr>
+                      <a:picLocks noChangeArrowheads="1" noChangeAspect="1"/>
+                    </pic:cNvPicPr>
+                  </pic:nvPicPr>
+                  <pic:blipFill>
+                    <a:blip r:embed="rId37"/>
+                    <a:stretch>
+                      <a:fillRect/>
+                    </a:stretch>
+                  </pic:blipFill>
+                  <pic:spPr bwMode="auto">
+                    <a:xfrm>
+                      <a:off x="0" y="0"/>
+                      <a:ext cx="5670550" cy="3894082"/>
+                    </a:xfrm>
+                    <a:prstGeom prst="rect">
+                      <a:avLst/>
+                    </a:prstGeom>
+                    <a:noFill/>
+                    <a:ln w="9525">
+                      <a:noFill/>
+                      <a:headEnd/>
+                      <a:tailEnd/>
+                    </a:ln>
+                  </pic:spPr>
+                </pic:pic>
+              </a:graphicData>
+            </a:graphic>
+          </wp:inline>
+        </w:drawing>
+      </w:r>
+    </w:p>
+    <w:p>
+      <w:pPr>
+        <w:pStyle w:val="ImageCaption"/>
+      </w:pPr>
+      <w:r>
+        <w:t xml:space="preserve">immutable и запреты на изменение</w:t>
+      </w:r>
+    </w:p>
+    <w:bookmarkEnd w:id="40"/>
+    <w:bookmarkStart w:id="44" w:name="снятие-immutable-и-восстановление-записи"/>
+    <w:p>
+      <w:pPr>
+        <w:pStyle w:val="Heading2"/>
+      </w:pPr>
+      <w:r>
+        <w:rPr>
+          <w:rStyle w:val="SectionNumber"/>
+        </w:rPr>
+        <w:t xml:space="preserve">2.6</w:t>
+      </w:r>
+      <w:r>
+        <w:tab/>
+      </w:r>
+      <w:r>
+        <w:t xml:space="preserve">снятие immutable и восстановление записи</w:t>
+      </w:r>
+    </w:p>
+    <w:p>
+      <w:pPr>
+        <w:pStyle w:val="FirstParagraph"/>
+      </w:pPr>
+      <w:r>
+        <w:t xml:space="preserve">После -i дозапись проходит; содержимое подтверждено cat.</w:t>
+      </w:r>
+    </w:p>
+    <w:p>
+      <w:pPr>
+        <w:pStyle w:val="CaptionedFigure"/>
+      </w:pPr>
+      <w:r>
+        <w:drawing>
+          <wp:inline>
+            <wp:extent cx="5670550" cy="3894082"/>
+            <wp:effectExtent b="0" l="0" r="0" t="0"/>
+            <wp:docPr descr="снятие immutable и восстановление записи" title="" id="42" name="Picture"/>
+            <a:graphic>
+              <a:graphicData uri="http://schemas.openxmlformats.org/drawingml/2006/picture">
+                <pic:pic>
+                  <pic:nvPicPr>
+                    <pic:cNvPr descr="image/04_after.jpg" id="43" name="Picture"/>
+                    <pic:cNvPicPr>
+                      <a:picLocks noChangeArrowheads="1" noChangeAspect="1"/>
+                    </pic:cNvPicPr>
+                  </pic:nvPicPr>
+                  <pic:blipFill>
+                    <a:blip r:embed="rId41"/>
+                    <a:stretch>
+                      <a:fillRect/>
+                    </a:stretch>
+                  </pic:blipFill>
+                  <pic:spPr bwMode="auto">
+                    <a:xfrm>
+                      <a:off x="0" y="0"/>
+                      <a:ext cx="5670550" cy="3894082"/>
+                    </a:xfrm>
+                    <a:prstGeom prst="rect">
+                      <a:avLst/>
+                    </a:prstGeom>
+                    <a:noFill/>
+                    <a:ln w="9525">
+                      <a:noFill/>
+                      <a:headEnd/>
+                      <a:tailEnd/>
+                    </a:ln>
+                  </pic:spPr>
+                </pic:pic>
+              </a:graphicData>
+            </a:graphic>
+          </wp:inline>
+        </w:drawing>
+      </w:r>
+    </w:p>
+    <w:p>
+      <w:pPr>
+        <w:pStyle w:val="ImageCaption"/>
+      </w:pPr>
+      <w:r>
+        <w:t xml:space="preserve">снятие immutable и восстановление записи</w:t>
+      </w:r>
+    </w:p>
+    <w:bookmarkEnd w:id="44"/>
+    <w:bookmarkEnd w:id="45"/>
+    <w:bookmarkStart w:id="46" w:name="выводы"/>
     <w:p>
       <w:pPr>
         <w:pStyle w:val="Heading1"/>
@@ -715,8 +706,8 @@
         <w:t xml:space="preserve">Получены практические навыки работы в консоли с расширенными атрибутами файлов.</w:t>
       </w:r>
     </w:p>
-    <w:bookmarkEnd w:id="34"/>
-    <w:bookmarkStart w:id="37" w:name="список-литературы"/>
+    <w:bookmarkEnd w:id="46"/>
+    <w:bookmarkStart w:id="49" w:name="список-литературы"/>
     <w:p>
       <w:pPr>
         <w:pStyle w:val="Heading1"/>
@@ -729,11 +720,11 @@
       <w:pPr>
         <w:numPr>
           <w:ilvl w:val="0"/>
-          <w:numId w:val="1010"/>
+          <w:numId w:val="1001"/>
         </w:numPr>
         <w:pStyle w:val="Compact"/>
       </w:pPr>
-      <w:hyperlink r:id="rId35">
+      <w:hyperlink r:id="rId47">
         <w:r>
           <w:rPr>
             <w:rStyle w:val="Hyperlink"/>
@@ -746,11 +737,11 @@
       <w:pPr>
         <w:numPr>
           <w:ilvl w:val="0"/>
-          <w:numId w:val="1010"/>
+          <w:numId w:val="1001"/>
         </w:numPr>
         <w:pStyle w:val="Compact"/>
       </w:pPr>
-      <w:hyperlink r:id="rId36">
+      <w:hyperlink r:id="rId48">
         <w:r>
           <w:rPr>
             <w:rStyle w:val="Hyperlink"/>
@@ -759,7 +750,7 @@
         </w:r>
       </w:hyperlink>
     </w:p>
-    <w:bookmarkEnd w:id="37"/>
+    <w:bookmarkEnd w:id="49"/>
     <w:sectPr>
       <w:footnotePr>
         <w:numRestart w:val="eachSect"/>
@@ -957,960 +948,10 @@
       </w:pPr>
     </w:lvl>
   </w:abstractNum>
-  <w:abstractNum w:abstractNumId="99413">
-    <w:nsid w:val="A99413"/>
-    <w:multiLevelType w:val="multilevel"/>
-    <w:lvl w:ilvl="0">
-      <w:start w:val="3"/>
-      <w:numFmt w:val="decimal"/>
-      <w:lvlText w:val="%1."/>
-      <w:lvlJc w:val="left"/>
-      <w:pPr>
-        <w:ind w:left="720" w:hanging="480"/>
-      </w:pPr>
-    </w:lvl>
-    <w:lvl w:ilvl="1">
-      <w:start w:val="3"/>
-      <w:numFmt w:val="decimal"/>
-      <w:lvlText w:val="%2."/>
-      <w:lvlJc w:val="left"/>
-      <w:pPr>
-        <w:ind w:left="1440" w:hanging="480"/>
-      </w:pPr>
-    </w:lvl>
-    <w:lvl w:ilvl="2">
-      <w:start w:val="3"/>
-      <w:numFmt w:val="decimal"/>
-      <w:lvlText w:val="%3."/>
-      <w:lvlJc w:val="left"/>
-      <w:pPr>
-        <w:ind w:left="2160" w:hanging="480"/>
-      </w:pPr>
-    </w:lvl>
-    <w:lvl w:ilvl="3">
-      <w:start w:val="3"/>
-      <w:numFmt w:val="decimal"/>
-      <w:lvlText w:val="%4."/>
-      <w:lvlJc w:val="left"/>
-      <w:pPr>
-        <w:ind w:left="2880" w:hanging="480"/>
-      </w:pPr>
-    </w:lvl>
-    <w:lvl w:ilvl="4">
-      <w:start w:val="3"/>
-      <w:numFmt w:val="decimal"/>
-      <w:lvlText w:val="%5."/>
-      <w:lvlJc w:val="left"/>
-      <w:pPr>
-        <w:ind w:left="3600" w:hanging="480"/>
-      </w:pPr>
-    </w:lvl>
-    <w:lvl w:ilvl="5">
-      <w:start w:val="3"/>
-      <w:numFmt w:val="decimal"/>
-      <w:lvlText w:val="%6."/>
-      <w:lvlJc w:val="left"/>
-      <w:pPr>
-        <w:ind w:left="4320" w:hanging="480"/>
-      </w:pPr>
-    </w:lvl>
-    <w:lvl w:ilvl="6">
-      <w:start w:val="3"/>
-      <w:numFmt w:val="decimal"/>
-      <w:lvlText w:val="%7."/>
-      <w:lvlJc w:val="left"/>
-      <w:pPr>
-        <w:ind w:left="5040" w:hanging="480"/>
-      </w:pPr>
-    </w:lvl>
-    <w:lvl w:ilvl="7">
-      <w:start w:val="3"/>
-      <w:numFmt w:val="decimal"/>
-      <w:lvlText w:val="%8."/>
-      <w:lvlJc w:val="left"/>
-      <w:pPr>
-        <w:ind w:left="5760" w:hanging="480"/>
-      </w:pPr>
-    </w:lvl>
-    <w:lvl w:ilvl="8">
-      <w:start w:val="3"/>
-      <w:numFmt w:val="decimal"/>
-      <w:lvlText w:val="%9."/>
-      <w:lvlJc w:val="left"/>
-      <w:pPr>
-        <w:ind w:left="6480" w:hanging="480"/>
-      </w:pPr>
-    </w:lvl>
-  </w:abstractNum>
-  <w:abstractNum w:abstractNumId="99414">
-    <w:nsid w:val="A99414"/>
-    <w:multiLevelType w:val="multilevel"/>
-    <w:lvl w:ilvl="0">
-      <w:start w:val="4"/>
-      <w:numFmt w:val="decimal"/>
-      <w:lvlText w:val="%1."/>
-      <w:lvlJc w:val="left"/>
-      <w:pPr>
-        <w:ind w:left="720" w:hanging="480"/>
-      </w:pPr>
-    </w:lvl>
-    <w:lvl w:ilvl="1">
-      <w:start w:val="4"/>
-      <w:numFmt w:val="decimal"/>
-      <w:lvlText w:val="%2."/>
-      <w:lvlJc w:val="left"/>
-      <w:pPr>
-        <w:ind w:left="1440" w:hanging="480"/>
-      </w:pPr>
-    </w:lvl>
-    <w:lvl w:ilvl="2">
-      <w:start w:val="4"/>
-      <w:numFmt w:val="decimal"/>
-      <w:lvlText w:val="%3."/>
-      <w:lvlJc w:val="left"/>
-      <w:pPr>
-        <w:ind w:left="2160" w:hanging="480"/>
-      </w:pPr>
-    </w:lvl>
-    <w:lvl w:ilvl="3">
-      <w:start w:val="4"/>
-      <w:numFmt w:val="decimal"/>
-      <w:lvlText w:val="%4."/>
-      <w:lvlJc w:val="left"/>
-      <w:pPr>
-        <w:ind w:left="2880" w:hanging="480"/>
-      </w:pPr>
-    </w:lvl>
-    <w:lvl w:ilvl="4">
-      <w:start w:val="4"/>
-      <w:numFmt w:val="decimal"/>
-      <w:lvlText w:val="%5."/>
-      <w:lvlJc w:val="left"/>
-      <w:pPr>
-        <w:ind w:left="3600" w:hanging="480"/>
-      </w:pPr>
-    </w:lvl>
-    <w:lvl w:ilvl="5">
-      <w:start w:val="4"/>
-      <w:numFmt w:val="decimal"/>
-      <w:lvlText w:val="%6."/>
-      <w:lvlJc w:val="left"/>
-      <w:pPr>
-        <w:ind w:left="4320" w:hanging="480"/>
-      </w:pPr>
-    </w:lvl>
-    <w:lvl w:ilvl="6">
-      <w:start w:val="4"/>
-      <w:numFmt w:val="decimal"/>
-      <w:lvlText w:val="%7."/>
-      <w:lvlJc w:val="left"/>
-      <w:pPr>
-        <w:ind w:left="5040" w:hanging="480"/>
-      </w:pPr>
-    </w:lvl>
-    <w:lvl w:ilvl="7">
-      <w:start w:val="4"/>
-      <w:numFmt w:val="decimal"/>
-      <w:lvlText w:val="%8."/>
-      <w:lvlJc w:val="left"/>
-      <w:pPr>
-        <w:ind w:left="5760" w:hanging="480"/>
-      </w:pPr>
-    </w:lvl>
-    <w:lvl w:ilvl="8">
-      <w:start w:val="4"/>
-      <w:numFmt w:val="decimal"/>
-      <w:lvlText w:val="%9."/>
-      <w:lvlJc w:val="left"/>
-      <w:pPr>
-        <w:ind w:left="6480" w:hanging="480"/>
-      </w:pPr>
-    </w:lvl>
-  </w:abstractNum>
-  <w:abstractNum w:abstractNumId="99415">
-    <w:nsid w:val="A99415"/>
-    <w:multiLevelType w:val="multilevel"/>
-    <w:lvl w:ilvl="0">
-      <w:start w:val="5"/>
-      <w:numFmt w:val="decimal"/>
-      <w:lvlText w:val="%1."/>
-      <w:lvlJc w:val="left"/>
-      <w:pPr>
-        <w:ind w:left="720" w:hanging="480"/>
-      </w:pPr>
-    </w:lvl>
-    <w:lvl w:ilvl="1">
-      <w:start w:val="5"/>
-      <w:numFmt w:val="decimal"/>
-      <w:lvlText w:val="%2."/>
-      <w:lvlJc w:val="left"/>
-      <w:pPr>
-        <w:ind w:left="1440" w:hanging="480"/>
-      </w:pPr>
-    </w:lvl>
-    <w:lvl w:ilvl="2">
-      <w:start w:val="5"/>
-      <w:numFmt w:val="decimal"/>
-      <w:lvlText w:val="%3."/>
-      <w:lvlJc w:val="left"/>
-      <w:pPr>
-        <w:ind w:left="2160" w:hanging="480"/>
-      </w:pPr>
-    </w:lvl>
-    <w:lvl w:ilvl="3">
-      <w:start w:val="5"/>
-      <w:numFmt w:val="decimal"/>
-      <w:lvlText w:val="%4."/>
-      <w:lvlJc w:val="left"/>
-      <w:pPr>
-        <w:ind w:left="2880" w:hanging="480"/>
-      </w:pPr>
-    </w:lvl>
-    <w:lvl w:ilvl="4">
-      <w:start w:val="5"/>
-      <w:numFmt w:val="decimal"/>
-      <w:lvlText w:val="%5."/>
-      <w:lvlJc w:val="left"/>
-      <w:pPr>
-        <w:ind w:left="3600" w:hanging="480"/>
-      </w:pPr>
-    </w:lvl>
-    <w:lvl w:ilvl="5">
-      <w:start w:val="5"/>
-      <w:numFmt w:val="decimal"/>
-      <w:lvlText w:val="%6."/>
-      <w:lvlJc w:val="left"/>
-      <w:pPr>
-        <w:ind w:left="4320" w:hanging="480"/>
-      </w:pPr>
-    </w:lvl>
-    <w:lvl w:ilvl="6">
-      <w:start w:val="5"/>
-      <w:numFmt w:val="decimal"/>
-      <w:lvlText w:val="%7."/>
-      <w:lvlJc w:val="left"/>
-      <w:pPr>
-        <w:ind w:left="5040" w:hanging="480"/>
-      </w:pPr>
-    </w:lvl>
-    <w:lvl w:ilvl="7">
-      <w:start w:val="5"/>
-      <w:numFmt w:val="decimal"/>
-      <w:lvlText w:val="%8."/>
-      <w:lvlJc w:val="left"/>
-      <w:pPr>
-        <w:ind w:left="5760" w:hanging="480"/>
-      </w:pPr>
-    </w:lvl>
-    <w:lvl w:ilvl="8">
-      <w:start w:val="5"/>
-      <w:numFmt w:val="decimal"/>
-      <w:lvlText w:val="%9."/>
-      <w:lvlJc w:val="left"/>
-      <w:pPr>
-        <w:ind w:left="6480" w:hanging="480"/>
-      </w:pPr>
-    </w:lvl>
-  </w:abstractNum>
-  <w:abstractNum w:abstractNumId="99416">
-    <w:nsid w:val="A99416"/>
-    <w:multiLevelType w:val="multilevel"/>
-    <w:lvl w:ilvl="0">
-      <w:start w:val="6"/>
-      <w:numFmt w:val="decimal"/>
-      <w:lvlText w:val="%1."/>
-      <w:lvlJc w:val="left"/>
-      <w:pPr>
-        <w:ind w:left="720" w:hanging="480"/>
-      </w:pPr>
-    </w:lvl>
-    <w:lvl w:ilvl="1">
-      <w:start w:val="6"/>
-      <w:numFmt w:val="decimal"/>
-      <w:lvlText w:val="%2."/>
-      <w:lvlJc w:val="left"/>
-      <w:pPr>
-        <w:ind w:left="1440" w:hanging="480"/>
-      </w:pPr>
-    </w:lvl>
-    <w:lvl w:ilvl="2">
-      <w:start w:val="6"/>
-      <w:numFmt w:val="decimal"/>
-      <w:lvlText w:val="%3."/>
-      <w:lvlJc w:val="left"/>
-      <w:pPr>
-        <w:ind w:left="2160" w:hanging="480"/>
-      </w:pPr>
-    </w:lvl>
-    <w:lvl w:ilvl="3">
-      <w:start w:val="6"/>
-      <w:numFmt w:val="decimal"/>
-      <w:lvlText w:val="%4."/>
-      <w:lvlJc w:val="left"/>
-      <w:pPr>
-        <w:ind w:left="2880" w:hanging="480"/>
-      </w:pPr>
-    </w:lvl>
-    <w:lvl w:ilvl="4">
-      <w:start w:val="6"/>
-      <w:numFmt w:val="decimal"/>
-      <w:lvlText w:val="%5."/>
-      <w:lvlJc w:val="left"/>
-      <w:pPr>
-        <w:ind w:left="3600" w:hanging="480"/>
-      </w:pPr>
-    </w:lvl>
-    <w:lvl w:ilvl="5">
-      <w:start w:val="6"/>
-      <w:numFmt w:val="decimal"/>
-      <w:lvlText w:val="%6."/>
-      <w:lvlJc w:val="left"/>
-      <w:pPr>
-        <w:ind w:left="4320" w:hanging="480"/>
-      </w:pPr>
-    </w:lvl>
-    <w:lvl w:ilvl="6">
-      <w:start w:val="6"/>
-      <w:numFmt w:val="decimal"/>
-      <w:lvlText w:val="%7."/>
-      <w:lvlJc w:val="left"/>
-      <w:pPr>
-        <w:ind w:left="5040" w:hanging="480"/>
-      </w:pPr>
-    </w:lvl>
-    <w:lvl w:ilvl="7">
-      <w:start w:val="6"/>
-      <w:numFmt w:val="decimal"/>
-      <w:lvlText w:val="%8."/>
-      <w:lvlJc w:val="left"/>
-      <w:pPr>
-        <w:ind w:left="5760" w:hanging="480"/>
-      </w:pPr>
-    </w:lvl>
-    <w:lvl w:ilvl="8">
-      <w:start w:val="6"/>
-      <w:numFmt w:val="decimal"/>
-      <w:lvlText w:val="%9."/>
-      <w:lvlJc w:val="left"/>
-      <w:pPr>
-        <w:ind w:left="6480" w:hanging="480"/>
-      </w:pPr>
-    </w:lvl>
-  </w:abstractNum>
-  <w:abstractNum w:abstractNumId="99417">
-    <w:nsid w:val="A99417"/>
-    <w:multiLevelType w:val="multilevel"/>
-    <w:lvl w:ilvl="0">
-      <w:start w:val="7"/>
-      <w:numFmt w:val="decimal"/>
-      <w:lvlText w:val="%1."/>
-      <w:lvlJc w:val="left"/>
-      <w:pPr>
-        <w:ind w:left="720" w:hanging="480"/>
-      </w:pPr>
-    </w:lvl>
-    <w:lvl w:ilvl="1">
-      <w:start w:val="7"/>
-      <w:numFmt w:val="decimal"/>
-      <w:lvlText w:val="%2."/>
-      <w:lvlJc w:val="left"/>
-      <w:pPr>
-        <w:ind w:left="1440" w:hanging="480"/>
-      </w:pPr>
-    </w:lvl>
-    <w:lvl w:ilvl="2">
-      <w:start w:val="7"/>
-      <w:numFmt w:val="decimal"/>
-      <w:lvlText w:val="%3."/>
-      <w:lvlJc w:val="left"/>
-      <w:pPr>
-        <w:ind w:left="2160" w:hanging="480"/>
-      </w:pPr>
-    </w:lvl>
-    <w:lvl w:ilvl="3">
-      <w:start w:val="7"/>
-      <w:numFmt w:val="decimal"/>
-      <w:lvlText w:val="%4."/>
-      <w:lvlJc w:val="left"/>
-      <w:pPr>
-        <w:ind w:left="2880" w:hanging="480"/>
-      </w:pPr>
-    </w:lvl>
-    <w:lvl w:ilvl="4">
-      <w:start w:val="7"/>
-      <w:numFmt w:val="decimal"/>
-      <w:lvlText w:val="%5."/>
-      <w:lvlJc w:val="left"/>
-      <w:pPr>
-        <w:ind w:left="3600" w:hanging="480"/>
-      </w:pPr>
-    </w:lvl>
-    <w:lvl w:ilvl="5">
-      <w:start w:val="7"/>
-      <w:numFmt w:val="decimal"/>
-      <w:lvlText w:val="%6."/>
-      <w:lvlJc w:val="left"/>
-      <w:pPr>
-        <w:ind w:left="4320" w:hanging="480"/>
-      </w:pPr>
-    </w:lvl>
-    <w:lvl w:ilvl="6">
-      <w:start w:val="7"/>
-      <w:numFmt w:val="decimal"/>
-      <w:lvlText w:val="%7."/>
-      <w:lvlJc w:val="left"/>
-      <w:pPr>
-        <w:ind w:left="5040" w:hanging="480"/>
-      </w:pPr>
-    </w:lvl>
-    <w:lvl w:ilvl="7">
-      <w:start w:val="7"/>
-      <w:numFmt w:val="decimal"/>
-      <w:lvlText w:val="%8."/>
-      <w:lvlJc w:val="left"/>
-      <w:pPr>
-        <w:ind w:left="5760" w:hanging="480"/>
-      </w:pPr>
-    </w:lvl>
-    <w:lvl w:ilvl="8">
-      <w:start w:val="7"/>
-      <w:numFmt w:val="decimal"/>
-      <w:lvlText w:val="%9."/>
-      <w:lvlJc w:val="left"/>
-      <w:pPr>
-        <w:ind w:left="6480" w:hanging="480"/>
-      </w:pPr>
-    </w:lvl>
-  </w:abstractNum>
-  <w:abstractNum w:abstractNumId="99418">
-    <w:nsid w:val="A99418"/>
-    <w:multiLevelType w:val="multilevel"/>
-    <w:lvl w:ilvl="0">
-      <w:start w:val="8"/>
-      <w:numFmt w:val="decimal"/>
-      <w:lvlText w:val="%1."/>
-      <w:lvlJc w:val="left"/>
-      <w:pPr>
-        <w:ind w:left="720" w:hanging="480"/>
-      </w:pPr>
-    </w:lvl>
-    <w:lvl w:ilvl="1">
-      <w:start w:val="8"/>
-      <w:numFmt w:val="decimal"/>
-      <w:lvlText w:val="%2."/>
-      <w:lvlJc w:val="left"/>
-      <w:pPr>
-        <w:ind w:left="1440" w:hanging="480"/>
-      </w:pPr>
-    </w:lvl>
-    <w:lvl w:ilvl="2">
-      <w:start w:val="8"/>
-      <w:numFmt w:val="decimal"/>
-      <w:lvlText w:val="%3."/>
-      <w:lvlJc w:val="left"/>
-      <w:pPr>
-        <w:ind w:left="2160" w:hanging="480"/>
-      </w:pPr>
-    </w:lvl>
-    <w:lvl w:ilvl="3">
-      <w:start w:val="8"/>
-      <w:numFmt w:val="decimal"/>
-      <w:lvlText w:val="%4."/>
-      <w:lvlJc w:val="left"/>
-      <w:pPr>
-        <w:ind w:left="2880" w:hanging="480"/>
-      </w:pPr>
-    </w:lvl>
-    <w:lvl w:ilvl="4">
-      <w:start w:val="8"/>
-      <w:numFmt w:val="decimal"/>
-      <w:lvlText w:val="%5."/>
-      <w:lvlJc w:val="left"/>
-      <w:pPr>
-        <w:ind w:left="3600" w:hanging="480"/>
-      </w:pPr>
-    </w:lvl>
-    <w:lvl w:ilvl="5">
-      <w:start w:val="8"/>
-      <w:numFmt w:val="decimal"/>
-      <w:lvlText w:val="%6."/>
-      <w:lvlJc w:val="left"/>
-      <w:pPr>
-        <w:ind w:left="4320" w:hanging="480"/>
-      </w:pPr>
-    </w:lvl>
-    <w:lvl w:ilvl="6">
-      <w:start w:val="8"/>
-      <w:numFmt w:val="decimal"/>
-      <w:lvlText w:val="%7."/>
-      <w:lvlJc w:val="left"/>
-      <w:pPr>
-        <w:ind w:left="5040" w:hanging="480"/>
-      </w:pPr>
-    </w:lvl>
-    <w:lvl w:ilvl="7">
-      <w:start w:val="8"/>
-      <w:numFmt w:val="decimal"/>
-      <w:lvlText w:val="%8."/>
-      <w:lvlJc w:val="left"/>
-      <w:pPr>
-        <w:ind w:left="5760" w:hanging="480"/>
-      </w:pPr>
-    </w:lvl>
-    <w:lvl w:ilvl="8">
-      <w:start w:val="8"/>
-      <w:numFmt w:val="decimal"/>
-      <w:lvlText w:val="%9."/>
-      <w:lvlJc w:val="left"/>
-      <w:pPr>
-        <w:ind w:left="6480" w:hanging="480"/>
-      </w:pPr>
-    </w:lvl>
-  </w:abstractNum>
-  <w:abstractNum w:abstractNumId="99419">
-    <w:nsid w:val="A99419"/>
-    <w:multiLevelType w:val="multilevel"/>
-    <w:lvl w:ilvl="0">
-      <w:start w:val="9"/>
-      <w:numFmt w:val="decimal"/>
-      <w:lvlText w:val="%1."/>
-      <w:lvlJc w:val="left"/>
-      <w:pPr>
-        <w:ind w:left="720" w:hanging="480"/>
-      </w:pPr>
-    </w:lvl>
-    <w:lvl w:ilvl="1">
-      <w:start w:val="9"/>
-      <w:numFmt w:val="decimal"/>
-      <w:lvlText w:val="%2."/>
-      <w:lvlJc w:val="left"/>
-      <w:pPr>
-        <w:ind w:left="1440" w:hanging="480"/>
-      </w:pPr>
-    </w:lvl>
-    <w:lvl w:ilvl="2">
-      <w:start w:val="9"/>
-      <w:numFmt w:val="decimal"/>
-      <w:lvlText w:val="%3."/>
-      <w:lvlJc w:val="left"/>
-      <w:pPr>
-        <w:ind w:left="2160" w:hanging="480"/>
-      </w:pPr>
-    </w:lvl>
-    <w:lvl w:ilvl="3">
-      <w:start w:val="9"/>
-      <w:numFmt w:val="decimal"/>
-      <w:lvlText w:val="%4."/>
-      <w:lvlJc w:val="left"/>
-      <w:pPr>
-        <w:ind w:left="2880" w:hanging="480"/>
-      </w:pPr>
-    </w:lvl>
-    <w:lvl w:ilvl="4">
-      <w:start w:val="9"/>
-      <w:numFmt w:val="decimal"/>
-      <w:lvlText w:val="%5."/>
-      <w:lvlJc w:val="left"/>
-      <w:pPr>
-        <w:ind w:left="3600" w:hanging="480"/>
-      </w:pPr>
-    </w:lvl>
-    <w:lvl w:ilvl="5">
-      <w:start w:val="9"/>
-      <w:numFmt w:val="decimal"/>
-      <w:lvlText w:val="%6."/>
-      <w:lvlJc w:val="left"/>
-      <w:pPr>
-        <w:ind w:left="4320" w:hanging="480"/>
-      </w:pPr>
-    </w:lvl>
-    <w:lvl w:ilvl="6">
-      <w:start w:val="9"/>
-      <w:numFmt w:val="decimal"/>
-      <w:lvlText w:val="%7."/>
-      <w:lvlJc w:val="left"/>
-      <w:pPr>
-        <w:ind w:left="5040" w:hanging="480"/>
-      </w:pPr>
-    </w:lvl>
-    <w:lvl w:ilvl="7">
-      <w:start w:val="9"/>
-      <w:numFmt w:val="decimal"/>
-      <w:lvlText w:val="%8."/>
-      <w:lvlJc w:val="left"/>
-      <w:pPr>
-        <w:ind w:left="5760" w:hanging="480"/>
-      </w:pPr>
-    </w:lvl>
-    <w:lvl w:ilvl="8">
-      <w:start w:val="9"/>
-      <w:numFmt w:val="decimal"/>
-      <w:lvlText w:val="%9."/>
-      <w:lvlJc w:val="left"/>
-      <w:pPr>
-        <w:ind w:left="6480" w:hanging="480"/>
-      </w:pPr>
-    </w:lvl>
-  </w:abstractNum>
-  <w:abstractNum w:abstractNumId="994110">
-    <w:nsid w:val="A994110"/>
-    <w:multiLevelType w:val="multilevel"/>
-    <w:lvl w:ilvl="0">
-      <w:start w:val="10"/>
-      <w:numFmt w:val="decimal"/>
-      <w:lvlText w:val="%1."/>
-      <w:lvlJc w:val="left"/>
-      <w:pPr>
-        <w:ind w:left="720" w:hanging="480"/>
-      </w:pPr>
-    </w:lvl>
-    <w:lvl w:ilvl="1">
-      <w:start w:val="10"/>
-      <w:numFmt w:val="decimal"/>
-      <w:lvlText w:val="%2."/>
-      <w:lvlJc w:val="left"/>
-      <w:pPr>
-        <w:ind w:left="1440" w:hanging="480"/>
-      </w:pPr>
-    </w:lvl>
-    <w:lvl w:ilvl="2">
-      <w:start w:val="10"/>
-      <w:numFmt w:val="decimal"/>
-      <w:lvlText w:val="%3."/>
-      <w:lvlJc w:val="left"/>
-      <w:pPr>
-        <w:ind w:left="2160" w:hanging="480"/>
-      </w:pPr>
-    </w:lvl>
-    <w:lvl w:ilvl="3">
-      <w:start w:val="10"/>
-      <w:numFmt w:val="decimal"/>
-      <w:lvlText w:val="%4."/>
-      <w:lvlJc w:val="left"/>
-      <w:pPr>
-        <w:ind w:left="2880" w:hanging="480"/>
-      </w:pPr>
-    </w:lvl>
-    <w:lvl w:ilvl="4">
-      <w:start w:val="10"/>
-      <w:numFmt w:val="decimal"/>
-      <w:lvlText w:val="%5."/>
-      <w:lvlJc w:val="left"/>
-      <w:pPr>
-        <w:ind w:left="3600" w:hanging="480"/>
-      </w:pPr>
-    </w:lvl>
-    <w:lvl w:ilvl="5">
-      <w:start w:val="10"/>
-      <w:numFmt w:val="decimal"/>
-      <w:lvlText w:val="%6."/>
-      <w:lvlJc w:val="left"/>
-      <w:pPr>
-        <w:ind w:left="4320" w:hanging="480"/>
-      </w:pPr>
-    </w:lvl>
-    <w:lvl w:ilvl="6">
-      <w:start w:val="10"/>
-      <w:numFmt w:val="decimal"/>
-      <w:lvlText w:val="%7."/>
-      <w:lvlJc w:val="left"/>
-      <w:pPr>
-        <w:ind w:left="5040" w:hanging="480"/>
-      </w:pPr>
-    </w:lvl>
-    <w:lvl w:ilvl="7">
-      <w:start w:val="10"/>
-      <w:numFmt w:val="decimal"/>
-      <w:lvlText w:val="%8."/>
-      <w:lvlJc w:val="left"/>
-      <w:pPr>
-        <w:ind w:left="5760" w:hanging="480"/>
-      </w:pPr>
-    </w:lvl>
-    <w:lvl w:ilvl="8">
-      <w:start w:val="10"/>
-      <w:numFmt w:val="decimal"/>
-      <w:lvlText w:val="%9."/>
-      <w:lvlJc w:val="left"/>
-      <w:pPr>
-        <w:ind w:left="6480" w:hanging="480"/>
-      </w:pPr>
-    </w:lvl>
-  </w:abstractNum>
   <w:num w:numId="1000">
     <w:abstractNumId w:val="990"/>
   </w:num>
   <w:num w:numId="1001">
-    <w:abstractNumId w:val="99411"/>
-    <w:lvlOverride w:ilvl="0">
-      <w:startOverride w:val="1"/>
-    </w:lvlOverride>
-    <w:lvlOverride w:ilvl="1">
-      <w:startOverride w:val="1"/>
-    </w:lvlOverride>
-    <w:lvlOverride w:ilvl="2">
-      <w:startOverride w:val="1"/>
-    </w:lvlOverride>
-    <w:lvlOverride w:ilvl="3">
-      <w:startOverride w:val="1"/>
-    </w:lvlOverride>
-    <w:lvlOverride w:ilvl="4">
-      <w:startOverride w:val="1"/>
-    </w:lvlOverride>
-    <w:lvlOverride w:ilvl="5">
-      <w:startOverride w:val="1"/>
-    </w:lvlOverride>
-    <w:lvlOverride w:ilvl="6">
-      <w:startOverride w:val="1"/>
-    </w:lvlOverride>
-    <w:lvlOverride w:ilvl="7">
-      <w:startOverride w:val="1"/>
-    </w:lvlOverride>
-    <w:lvlOverride w:ilvl="8">
-      <w:startOverride w:val="1"/>
-    </w:lvlOverride>
-  </w:num>
-  <w:num w:numId="1002">
-    <w:abstractNumId w:val="99413"/>
-    <w:lvlOverride w:ilvl="0">
-      <w:startOverride w:val="3"/>
-    </w:lvlOverride>
-    <w:lvlOverride w:ilvl="1">
-      <w:startOverride w:val="3"/>
-    </w:lvlOverride>
-    <w:lvlOverride w:ilvl="2">
-      <w:startOverride w:val="3"/>
-    </w:lvlOverride>
-    <w:lvlOverride w:ilvl="3">
-      <w:startOverride w:val="3"/>
-    </w:lvlOverride>
-    <w:lvlOverride w:ilvl="4">
-      <w:startOverride w:val="3"/>
-    </w:lvlOverride>
-    <w:lvlOverride w:ilvl="5">
-      <w:startOverride w:val="3"/>
-    </w:lvlOverride>
-    <w:lvlOverride w:ilvl="6">
-      <w:startOverride w:val="3"/>
-    </w:lvlOverride>
-    <w:lvlOverride w:ilvl="7">
-      <w:startOverride w:val="3"/>
-    </w:lvlOverride>
-    <w:lvlOverride w:ilvl="8">
-      <w:startOverride w:val="3"/>
-    </w:lvlOverride>
-  </w:num>
-  <w:num w:numId="1003">
-    <w:abstractNumId w:val="99414"/>
-    <w:lvlOverride w:ilvl="0">
-      <w:startOverride w:val="4"/>
-    </w:lvlOverride>
-    <w:lvlOverride w:ilvl="1">
-      <w:startOverride w:val="4"/>
-    </w:lvlOverride>
-    <w:lvlOverride w:ilvl="2">
-      <w:startOverride w:val="4"/>
-    </w:lvlOverride>
-    <w:lvlOverride w:ilvl="3">
-      <w:startOverride w:val="4"/>
-    </w:lvlOverride>
-    <w:lvlOverride w:ilvl="4">
-      <w:startOverride w:val="4"/>
-    </w:lvlOverride>
-    <w:lvlOverride w:ilvl="5">
-      <w:startOverride w:val="4"/>
-    </w:lvlOverride>
-    <w:lvlOverride w:ilvl="6">
-      <w:startOverride w:val="4"/>
-    </w:lvlOverride>
-    <w:lvlOverride w:ilvl="7">
-      <w:startOverride w:val="4"/>
-    </w:lvlOverride>
-    <w:lvlOverride w:ilvl="8">
-      <w:startOverride w:val="4"/>
-    </w:lvlOverride>
-  </w:num>
-  <w:num w:numId="1004">
-    <w:abstractNumId w:val="99415"/>
-    <w:lvlOverride w:ilvl="0">
-      <w:startOverride w:val="5"/>
-    </w:lvlOverride>
-    <w:lvlOverride w:ilvl="1">
-      <w:startOverride w:val="5"/>
-    </w:lvlOverride>
-    <w:lvlOverride w:ilvl="2">
-      <w:startOverride w:val="5"/>
-    </w:lvlOverride>
-    <w:lvlOverride w:ilvl="3">
-      <w:startOverride w:val="5"/>
-    </w:lvlOverride>
-    <w:lvlOverride w:ilvl="4">
-      <w:startOverride w:val="5"/>
-    </w:lvlOverride>
-    <w:lvlOverride w:ilvl="5">
-      <w:startOverride w:val="5"/>
-    </w:lvlOverride>
-    <w:lvlOverride w:ilvl="6">
-      <w:startOverride w:val="5"/>
-    </w:lvlOverride>
-    <w:lvlOverride w:ilvl="7">
-      <w:startOverride w:val="5"/>
-    </w:lvlOverride>
-    <w:lvlOverride w:ilvl="8">
-      <w:startOverride w:val="5"/>
-    </w:lvlOverride>
-  </w:num>
-  <w:num w:numId="1005">
-    <w:abstractNumId w:val="99416"/>
-    <w:lvlOverride w:ilvl="0">
-      <w:startOverride w:val="6"/>
-    </w:lvlOverride>
-    <w:lvlOverride w:ilvl="1">
-      <w:startOverride w:val="6"/>
-    </w:lvlOverride>
-    <w:lvlOverride w:ilvl="2">
-      <w:startOverride w:val="6"/>
-    </w:lvlOverride>
-    <w:lvlOverride w:ilvl="3">
-      <w:startOverride w:val="6"/>
-    </w:lvlOverride>
-    <w:lvlOverride w:ilvl="4">
-      <w:startOverride w:val="6"/>
-    </w:lvlOverride>
-    <w:lvlOverride w:ilvl="5">
-      <w:startOverride w:val="6"/>
-    </w:lvlOverride>
-    <w:lvlOverride w:ilvl="6">
-      <w:startOverride w:val="6"/>
-    </w:lvlOverride>
-    <w:lvlOverride w:ilvl="7">
-      <w:startOverride w:val="6"/>
-    </w:lvlOverride>
-    <w:lvlOverride w:ilvl="8">
-      <w:startOverride w:val="6"/>
-    </w:lvlOverride>
-  </w:num>
-  <w:num w:numId="1006">
-    <w:abstractNumId w:val="99417"/>
-    <w:lvlOverride w:ilvl="0">
-      <w:startOverride w:val="7"/>
-    </w:lvlOverride>
-    <w:lvlOverride w:ilvl="1">
-      <w:startOverride w:val="7"/>
-    </w:lvlOverride>
-    <w:lvlOverride w:ilvl="2">
-      <w:startOverride w:val="7"/>
-    </w:lvlOverride>
-    <w:lvlOverride w:ilvl="3">
-      <w:startOverride w:val="7"/>
-    </w:lvlOverride>
-    <w:lvlOverride w:ilvl="4">
-      <w:startOverride w:val="7"/>
-    </w:lvlOverride>
-    <w:lvlOverride w:ilvl="5">
-      <w:startOverride w:val="7"/>
-    </w:lvlOverride>
-    <w:lvlOverride w:ilvl="6">
-      <w:startOverride w:val="7"/>
-    </w:lvlOverride>
-    <w:lvlOverride w:ilvl="7">
-      <w:startOverride w:val="7"/>
-    </w:lvlOverride>
-    <w:lvlOverride w:ilvl="8">
-      <w:startOverride w:val="7"/>
-    </w:lvlOverride>
-  </w:num>
-  <w:num w:numId="1007">
-    <w:abstractNumId w:val="99418"/>
-    <w:lvlOverride w:ilvl="0">
-      <w:startOverride w:val="8"/>
-    </w:lvlOverride>
-    <w:lvlOverride w:ilvl="1">
-      <w:startOverride w:val="8"/>
-    </w:lvlOverride>
-    <w:lvlOverride w:ilvl="2">
-      <w:startOverride w:val="8"/>
-    </w:lvlOverride>
-    <w:lvlOverride w:ilvl="3">
-      <w:startOverride w:val="8"/>
-    </w:lvlOverride>
-    <w:lvlOverride w:ilvl="4">
-      <w:startOverride w:val="8"/>
-    </w:lvlOverride>
-    <w:lvlOverride w:ilvl="5">
-      <w:startOverride w:val="8"/>
-    </w:lvlOverride>
-    <w:lvlOverride w:ilvl="6">
-      <w:startOverride w:val="8"/>
-    </w:lvlOverride>
-    <w:lvlOverride w:ilvl="7">
-      <w:startOverride w:val="8"/>
-    </w:lvlOverride>
-    <w:lvlOverride w:ilvl="8">
-      <w:startOverride w:val="8"/>
-    </w:lvlOverride>
-  </w:num>
-  <w:num w:numId="1008">
-    <w:abstractNumId w:val="99419"/>
-    <w:lvlOverride w:ilvl="0">
-      <w:startOverride w:val="9"/>
-    </w:lvlOverride>
-    <w:lvlOverride w:ilvl="1">
-      <w:startOverride w:val="9"/>
-    </w:lvlOverride>
-    <w:lvlOverride w:ilvl="2">
-      <w:startOverride w:val="9"/>
-    </w:lvlOverride>
-    <w:lvlOverride w:ilvl="3">
-      <w:startOverride w:val="9"/>
-    </w:lvlOverride>
-    <w:lvlOverride w:ilvl="4">
-      <w:startOverride w:val="9"/>
-    </w:lvlOverride>
-    <w:lvlOverride w:ilvl="5">
-      <w:startOverride w:val="9"/>
-    </w:lvlOverride>
-    <w:lvlOverride w:ilvl="6">
-      <w:startOverride w:val="9"/>
-    </w:lvlOverride>
-    <w:lvlOverride w:ilvl="7">
-      <w:startOverride w:val="9"/>
-    </w:lvlOverride>
-    <w:lvlOverride w:ilvl="8">
-      <w:startOverride w:val="9"/>
-    </w:lvlOverride>
-  </w:num>
-  <w:num w:numId="1009">
-    <w:abstractNumId w:val="994110"/>
-    <w:lvlOverride w:ilvl="0">
-      <w:startOverride w:val="10"/>
-    </w:lvlOverride>
-    <w:lvlOverride w:ilvl="1">
-      <w:startOverride w:val="10"/>
-    </w:lvlOverride>
-    <w:lvlOverride w:ilvl="2">
-      <w:startOverride w:val="10"/>
-    </w:lvlOverride>
-    <w:lvlOverride w:ilvl="3">
-      <w:startOverride w:val="10"/>
-    </w:lvlOverride>
-    <w:lvlOverride w:ilvl="4">
-      <w:startOverride w:val="10"/>
-    </w:lvlOverride>
-    <w:lvlOverride w:ilvl="5">
-      <w:startOverride w:val="10"/>
-    </w:lvlOverride>
-    <w:lvlOverride w:ilvl="6">
-      <w:startOverride w:val="10"/>
-    </w:lvlOverride>
-    <w:lvlOverride w:ilvl="7">
-      <w:startOverride w:val="10"/>
-    </w:lvlOverride>
-    <w:lvlOverride w:ilvl="8">
-      <w:startOverride w:val="10"/>
-    </w:lvlOverride>
-  </w:num>
-  <w:num w:numId="1010">
     <w:abstractNumId w:val="99411"/>
     <w:lvlOverride w:ilvl="0">
       <w:startOverride w:val="1"/>
@@ -2609,6 +1650,10 @@
       <w:wordWrap w:val="off"/>
       <w:shd w:fill="f1f3f5" w:val="clear"/>
     </w:pPr>
+    <w:rPr>
+      <w:rFonts w:ascii="DejaVu Sans Mono" w:hAnsi="DejaVu Sans Mono"/>
+      <w:sz w:val="15"/>
+    </w:rPr>
   </w:style>
   <w:style w:customStyle="1" w:styleId="KeywordTok" w:type="character">
     <w:name w:val="KeywordTok"/>

</xml_diff>